<commit_message>
Add complete ARIA support screen and cooler with plain-language scripts
</commit_message>
<xml_diff>
--- a/Guion_ARIA.docx
+++ b/Guion_ARIA.docx
@@ -21,7 +21,7 @@
         <w:rPr>
           <w:b w:val="0"/>
         </w:rPr>
-        <w:t>Seis roles para una presentación de quince minutos</w:t>
+        <w:t>Qué queremos lograr y cómo construimos el prototipo</w:t>
       </w:r>
     </w:p>
     <w:p>
@@ -33,7 +33,7 @@
         <w:br/>
         <w:t>Articulación con el Servicio Nacional de Aprendizaje SENA</w:t>
         <w:br/>
-        <w:t>15 de octubre de 2026</w:t>
+        <w:t>16 de octubre de 2026</w:t>
       </w:r>
     </w:p>
     <w:p>
@@ -41,7 +41,7 @@
         <w:rPr>
           <w:b w:val="0"/>
         </w:rPr>
-        <w:t>Este guion organiza la explicación del asistente ARIA y su CNC de escritura. La exposición relaciona el propósito educativo, la arquitectura de voz, el control electrónico y el modelo mecánico. Cada integrante tiene un texto oral y respuestas técnicas para ensayar. La demostración diferencia la preparación de trayectorias de la escritura física sobre papel.</w:t>
+        <w:t>Explicar qué queremos conseguir con ARIA, qué hace cada parte y cómo construimos el prototipo, para que una persona sin formación técnica siga la presentación.</w:t>
       </w:r>
     </w:p>
     <w:p>
@@ -49,7 +49,15 @@
         <w:rPr>
           <w:b w:val="0"/>
         </w:rPr>
-        <w:t>Marca ARIA. Eslogan aprobado para la presentación: «Tu voz toma forma». Los nombres personales se mantienen como roles genéricos.</w:t>
+        <w:t>ARIA une conversación, un rostro en pantalla y un mecanismo que prepara trazos. La meta es llevar esos trazos al papel. El guion explica los términos al decirlos y distingue lo ya comprobado de la escritura física que todavía falta demostrar.</w:t>
+      </w:r>
+    </w:p>
+    <w:p>
+      <w:r>
+        <w:rPr>
+          <w:b w:val="0"/>
+        </w:rPr>
+        <w:t>Marca ARIA. Lema «Tu voz toma forma». Los seis integrantes se identifican por roles genéricos. El texto de cada diapositiva es lo que dice la persona; los pasos de demostración y los anexos se consultan aparte.</w:t>
       </w:r>
     </w:p>
     <w:p>
@@ -104,7 +112,7 @@
                 <w:rFonts w:ascii="Arial" w:hAnsi="Arial"/>
                 <w:b/>
                 <w:color w:val="FFFFFF"/>
-                <w:sz w:val="19"/>
+                <w:sz w:val="18"/>
               </w:rPr>
               <w:t>Tiempo</w:t>
             </w:r>
@@ -138,7 +146,7 @@
                 <w:rFonts w:ascii="Arial" w:hAnsi="Arial"/>
                 <w:b/>
                 <w:color w:val="FFFFFF"/>
-                <w:sz w:val="19"/>
+                <w:sz w:val="18"/>
               </w:rPr>
               <w:t>Responsable</w:t>
             </w:r>
@@ -172,7 +180,7 @@
                 <w:rFonts w:ascii="Arial" w:hAnsi="Arial"/>
                 <w:b/>
                 <w:color w:val="FFFFFF"/>
-                <w:sz w:val="19"/>
+                <w:sz w:val="18"/>
               </w:rPr>
               <w:t>Diapositivas</w:t>
             </w:r>
@@ -210,7 +218,7 @@
                 <w:rFonts w:ascii="Arial" w:hAnsi="Arial"/>
                 <w:b w:val="0"/>
                 <w:color w:val="000000"/>
-                <w:sz w:val="19"/>
+                <w:sz w:val="18"/>
               </w:rPr>
               <w:t>00:00 a 02:00</w:t>
             </w:r>
@@ -244,7 +252,7 @@
                 <w:rFonts w:ascii="Arial" w:hAnsi="Arial"/>
                 <w:b w:val="0"/>
                 <w:color w:val="000000"/>
-                <w:sz w:val="19"/>
+                <w:sz w:val="18"/>
               </w:rPr>
               <w:t>Gestor de proyecto</w:t>
             </w:r>
@@ -278,7 +286,7 @@
                 <w:rFonts w:ascii="Arial" w:hAnsi="Arial"/>
                 <w:b w:val="0"/>
                 <w:color w:val="000000"/>
-                <w:sz w:val="19"/>
+                <w:sz w:val="18"/>
               </w:rPr>
               <w:t>1 a 3</w:t>
             </w:r>
@@ -316,7 +324,7 @@
                 <w:rFonts w:ascii="Arial" w:hAnsi="Arial"/>
                 <w:b w:val="0"/>
                 <w:color w:val="000000"/>
-                <w:sz w:val="19"/>
+                <w:sz w:val="18"/>
               </w:rPr>
               <w:t>02:00 a 04:00</w:t>
             </w:r>
@@ -350,7 +358,7 @@
                 <w:rFonts w:ascii="Arial" w:hAnsi="Arial"/>
                 <w:b w:val="0"/>
                 <w:color w:val="000000"/>
-                <w:sz w:val="19"/>
+                <w:sz w:val="18"/>
               </w:rPr>
               <w:t>Ingeniero de IA</w:t>
             </w:r>
@@ -384,7 +392,7 @@
                 <w:rFonts w:ascii="Arial" w:hAnsi="Arial"/>
                 <w:b w:val="0"/>
                 <w:color w:val="000000"/>
-                <w:sz w:val="19"/>
+                <w:sz w:val="18"/>
               </w:rPr>
               <w:t>4 y 5</w:t>
             </w:r>
@@ -422,7 +430,7 @@
                 <w:rFonts w:ascii="Arial" w:hAnsi="Arial"/>
                 <w:b w:val="0"/>
                 <w:color w:val="000000"/>
-                <w:sz w:val="19"/>
+                <w:sz w:val="18"/>
               </w:rPr>
               <w:t>04:00 a 06:00</w:t>
             </w:r>
@@ -456,7 +464,7 @@
                 <w:rFonts w:ascii="Arial" w:hAnsi="Arial"/>
                 <w:b w:val="0"/>
                 <w:color w:val="000000"/>
-                <w:sz w:val="19"/>
+                <w:sz w:val="18"/>
               </w:rPr>
               <w:t>Especialista en hardware 1</w:t>
             </w:r>
@@ -490,7 +498,7 @@
                 <w:rFonts w:ascii="Arial" w:hAnsi="Arial"/>
                 <w:b w:val="0"/>
                 <w:color w:val="000000"/>
-                <w:sz w:val="19"/>
+                <w:sz w:val="18"/>
               </w:rPr>
               <w:t>6 y 7</w:t>
             </w:r>
@@ -528,7 +536,7 @@
                 <w:rFonts w:ascii="Arial" w:hAnsi="Arial"/>
                 <w:b w:val="0"/>
                 <w:color w:val="000000"/>
-                <w:sz w:val="19"/>
+                <w:sz w:val="18"/>
               </w:rPr>
               <w:t>06:00 a 08:00</w:t>
             </w:r>
@@ -562,7 +570,7 @@
                 <w:rFonts w:ascii="Arial" w:hAnsi="Arial"/>
                 <w:b w:val="0"/>
                 <w:color w:val="000000"/>
-                <w:sz w:val="19"/>
+                <w:sz w:val="18"/>
               </w:rPr>
               <w:t>Especialista en hardware 2</w:t>
             </w:r>
@@ -596,7 +604,7 @@
                 <w:rFonts w:ascii="Arial" w:hAnsi="Arial"/>
                 <w:b w:val="0"/>
                 <w:color w:val="000000"/>
-                <w:sz w:val="19"/>
+                <w:sz w:val="18"/>
               </w:rPr>
               <w:t>8 y 9</w:t>
             </w:r>
@@ -634,7 +642,7 @@
                 <w:rFonts w:ascii="Arial" w:hAnsi="Arial"/>
                 <w:b w:val="0"/>
                 <w:color w:val="000000"/>
-                <w:sz w:val="19"/>
+                <w:sz w:val="18"/>
               </w:rPr>
               <w:t>08:00 a 10:00</w:t>
             </w:r>
@@ -668,7 +676,7 @@
                 <w:rFonts w:ascii="Arial" w:hAnsi="Arial"/>
                 <w:b w:val="0"/>
                 <w:color w:val="000000"/>
-                <w:sz w:val="19"/>
+                <w:sz w:val="18"/>
               </w:rPr>
               <w:t>Desarrollador</w:t>
             </w:r>
@@ -702,7 +710,7 @@
                 <w:rFonts w:ascii="Arial" w:hAnsi="Arial"/>
                 <w:b w:val="0"/>
                 <w:color w:val="000000"/>
-                <w:sz w:val="19"/>
+                <w:sz w:val="18"/>
               </w:rPr>
               <w:t>10 y 11</w:t>
             </w:r>
@@ -740,7 +748,7 @@
                 <w:rFonts w:ascii="Arial" w:hAnsi="Arial"/>
                 <w:b w:val="0"/>
                 <w:color w:val="000000"/>
-                <w:sz w:val="19"/>
+                <w:sz w:val="18"/>
               </w:rPr>
               <w:t>10:00 a 12:00</w:t>
             </w:r>
@@ -774,7 +782,7 @@
                 <w:rFonts w:ascii="Arial" w:hAnsi="Arial"/>
                 <w:b w:val="0"/>
                 <w:color w:val="000000"/>
-                <w:sz w:val="19"/>
+                <w:sz w:val="18"/>
               </w:rPr>
               <w:t>Maquetador y demostración</w:t>
             </w:r>
@@ -808,7 +816,7 @@
                 <w:rFonts w:ascii="Arial" w:hAnsi="Arial"/>
                 <w:b w:val="0"/>
                 <w:color w:val="000000"/>
-                <w:sz w:val="19"/>
+                <w:sz w:val="18"/>
               </w:rPr>
               <w:t>12 a 15</w:t>
             </w:r>
@@ -846,7 +854,7 @@
                 <w:rFonts w:ascii="Arial" w:hAnsi="Arial"/>
                 <w:b w:val="0"/>
                 <w:color w:val="000000"/>
-                <w:sz w:val="19"/>
+                <w:sz w:val="18"/>
               </w:rPr>
               <w:t>12:00 a 15:00</w:t>
             </w:r>
@@ -880,9 +888,9 @@
                 <w:rFonts w:ascii="Arial" w:hAnsi="Arial"/>
                 <w:b w:val="0"/>
                 <w:color w:val="000000"/>
-                <w:sz w:val="19"/>
+                <w:sz w:val="18"/>
               </w:rPr>
-              <w:t>Videoclip de cierre</w:t>
+              <w:t>Video con narración en español latino</w:t>
             </w:r>
           </w:p>
         </w:tc>
@@ -914,7 +922,7 @@
                 <w:rFonts w:ascii="Arial" w:hAnsi="Arial"/>
                 <w:b w:val="0"/>
                 <w:color w:val="000000"/>
-                <w:sz w:val="19"/>
+                <w:sz w:val="18"/>
               </w:rPr>
               <w:t>16</w:t>
             </w:r>
@@ -952,7 +960,7 @@
                 <w:rFonts w:ascii="Arial" w:hAnsi="Arial"/>
                 <w:b w:val="0"/>
                 <w:color w:val="000000"/>
-                <w:sz w:val="19"/>
+                <w:sz w:val="18"/>
               </w:rPr>
               <w:t>15:00 a 20:00</w:t>
             </w:r>
@@ -986,7 +994,7 @@
                 <w:rFonts w:ascii="Arial" w:hAnsi="Arial"/>
                 <w:b w:val="0"/>
                 <w:color w:val="000000"/>
-                <w:sz w:val="19"/>
+                <w:sz w:val="18"/>
               </w:rPr>
               <w:t>Preguntas del jurado</w:t>
             </w:r>
@@ -1020,9 +1028,9 @@
                 <w:rFonts w:ascii="Arial" w:hAnsi="Arial"/>
                 <w:b w:val="0"/>
                 <w:color w:val="000000"/>
-                <w:sz w:val="19"/>
+                <w:sz w:val="18"/>
               </w:rPr>
-              <w:t>Anexos</w:t>
+              <w:t>Apoyos y anexos</w:t>
             </w:r>
           </w:p>
         </w:tc>
@@ -1038,7 +1046,7 @@
         <w:rPr>
           <w:b w:val="0"/>
         </w:rPr>
-        <w:t>La guía reserva doce minutos para exposición y demostración, tres minutos para el videoclip y cinco minutos adicionales para preguntas. Los cambios de expositor forman parte del tiempo asignado.</w:t>
+        <w:t>La guía SENA fija 12 minutos para exposición y demostración, 3 minutos para el video de cierre y 5 minutos adicionales para preguntas. Cada cambio de persona forma parte de sus dos minutos.</w:t>
       </w:r>
     </w:p>
     <w:p>
@@ -1046,7 +1054,7 @@
         <w:rPr>
           <w:b/>
         </w:rPr>
-        <w:t>Usar en voz alta únicamente los textos bajo «Discurso oral». Las instrucciones de demostración, ensayo y evidencias pendientes se consultan aparte.</w:t>
+        <w:t>Ensayar con pausas y señalando la pieza o imagen correspondiente. No leer las preguntas ni los anexos durante la exposición.</w:t>
       </w:r>
     </w:p>
     <w:p>
@@ -1067,7 +1075,15 @@
         <w:rPr>
           <w:b/>
         </w:rPr>
-        <w:t>Intervención 1   00:00–02:00   Diapositivas 1, 2, 3   231 palabras</w:t>
+        <w:t>Intervención 1   00:00–02:00   Diapositivas 1, 2, 3</w:t>
+      </w:r>
+    </w:p>
+    <w:p>
+      <w:r>
+        <w:rPr>
+          <w:b w:val="0"/>
+        </w:rPr>
+        <w:t>Propósito del rol: Presentar para qué sirve ARIA, qué queremos lograr y cómo organizamos el presupuesto.</w:t>
       </w:r>
     </w:p>
     <w:p>
@@ -1075,7 +1091,97 @@
         <w:pStyle w:val="Heading2"/>
       </w:pPr>
       <w:r>
-        <w:t>Discurso oral</w:t>
+        <w:t>Diapositiva 1 Presentación de ARIA</w:t>
+      </w:r>
+    </w:p>
+    <w:p>
+      <w:pPr>
+        <w:keepNext/>
+        <w:spacing w:after="80"/>
+      </w:pPr>
+      <w:r>
+        <w:rPr>
+          <w:b w:val="0"/>
+          <w:i/>
+          <w:sz w:val="19"/>
+        </w:rPr>
+        <w:t>00:00–00:30</w:t>
+      </w:r>
+    </w:p>
+    <w:p>
+      <w:r>
+        <w:rPr>
+          <w:b w:val="0"/>
+        </w:rPr>
+        <w:t>Buenos días, jurados, docentes y compañeros. Somos el equipo de ARIA, de la Institución Educativa Carlos Julio Torrado Peñaranda, en articulación con el SENA. Nuestro lema es «Tu voz toma forma». ARIA es un prototipo: una primera versión de un asistente que une conversación, un rostro en pantalla y un mecanismo para preparar trazos.</w:t>
+      </w:r>
+    </w:p>
+    <w:p>
+      <w:pPr>
+        <w:pStyle w:val="Heading2"/>
+      </w:pPr>
+      <w:r>
+        <w:t>Diapositiva 2 Necesidad y objetivos</w:t>
+      </w:r>
+    </w:p>
+    <w:p>
+      <w:pPr>
+        <w:keepNext/>
+        <w:spacing w:after="80"/>
+      </w:pPr>
+      <w:r>
+        <w:rPr>
+          <w:b w:val="0"/>
+          <w:i/>
+          <w:sz w:val="19"/>
+        </w:rPr>
+        <w:t>00:30–01:10</w:t>
+      </w:r>
+    </w:p>
+    <w:p>
+      <w:r>
+        <w:rPr>
+          <w:b w:val="0"/>
+        </w:rPr>
+        <w:t>Queremos que aprender tecnología sea algo que podamos ver y probar. La idea es decir una palabra, pedir una figura o una gráfica y comprender cómo el equipo prepara sus movimientos. El objetivo final es que un lápiz lleve esos trazos al papel. El mecanismo es una CNC, es decir, una máquina que sigue movimientos indicados por un computador. Así podemos relacionar lenguaje, matemáticas y construcción. Buscamos que estudiantes y docentes participen en el proceso y entiendan qué hace cada parte.</w:t>
+      </w:r>
+    </w:p>
+    <w:p>
+      <w:pPr>
+        <w:pStyle w:val="Heading2"/>
+      </w:pPr>
+      <w:r>
+        <w:t>Diapositiva 3 Presupuesto y recursos</w:t>
+      </w:r>
+    </w:p>
+    <w:p>
+      <w:pPr>
+        <w:keepNext/>
+        <w:spacing w:after="80"/>
+      </w:pPr>
+      <w:r>
+        <w:rPr>
+          <w:b w:val="0"/>
+          <w:i/>
+          <w:sz w:val="19"/>
+        </w:rPr>
+        <w:t>01:10–02:00</w:t>
+      </w:r>
+    </w:p>
+    <w:p>
+      <w:r>
+        <w:rPr>
+          <w:b w:val="0"/>
+        </w:rPr>
+        <w:t>Para cuidar el presupuesto, partimos de los componentes disponibles y calculamos qué faltaría comprar. La referencia completa es de un millón noventa mil cuatrocientos cuarenta y ocho pesos, con una reserva para imprevistos. Incluye tres motores, Arduino, Raspberry, cables, impresión y servicios de voz. Reservamos diez dólares para OpenAI y diez para ElevenLabs. No es una suma de facturas ni un cobro mensual fijo. El gasto real depende de lo que ya tenemos y del uso de los servicios. Ahora explicaremos cómo se conectan la voz y la programación.</w:t>
+      </w:r>
+    </w:p>
+    <w:p>
+      <w:pPr>
+        <w:pStyle w:val="Heading2"/>
+      </w:pPr>
+      <w:r>
+        <w:t>Preguntas del jurado para ensayar</w:t>
       </w:r>
     </w:p>
     <w:p>
@@ -1086,7 +1192,7 @@
         <w:rPr>
           <w:b/>
         </w:rPr>
-        <w:t>Diapositiva 1   00:00–00:25</w:t>
+        <w:t>¿Para qué sirve ARIA?</w:t>
       </w:r>
     </w:p>
     <w:p>
@@ -1094,7 +1200,7 @@
         <w:rPr>
           <w:b w:val="0"/>
         </w:rPr>
-        <w:t>Buenos días, jurados, docentes y compañeros. Presentamos ARIA, nuestro asistente con voz, rostro y una plataforma CNC para transformar instrucciones en trazos. Su eslogan es «Tu voz toma forma». Este proyecto pertenece a la I.E. Carlos Julio Torrado Peñaranda, en articulación con el SENA.</w:t>
+        <w:t>Para aprender cómo una petición hablada puede convertirse en una respuesta y en movimientos preparados por un computador. Proponemos usarlo con letras, figuras y gráficas. La escritura física en papel es el objetivo que todavía debemos demostrar.</w:t>
       </w:r>
     </w:p>
     <w:p>
@@ -1105,7 +1211,7 @@
         <w:rPr>
           <w:b/>
         </w:rPr>
-        <w:t>Diapositiva 2   00:25–01:05</w:t>
+        <w:t>¿Ese presupuesto es lo que gastaron?</w:t>
       </w:r>
     </w:p>
     <w:p>
@@ -1113,7 +1219,7 @@
         <w:rPr>
           <w:b w:val="0"/>
         </w:rPr>
-        <w:t>Partimos de una necesidad educativa: conectar la conversación con resultados que puedan observarse y comprenderse. La idea es pedir una palabra, una figura o una función y mostrar cómo esa intención se convierte en una trayectoria. Nuestro objetivo general es integrar asistencia por voz y control de escritura. Los objetivos específicos son reconocer la solicitud, preparar trazos válidos y coordinar movimientos dentro de un área medida. El impacto esperado es apoyar actividades de tecnología y matemáticas, y explorar interfaces accesibles; su utilidad debe evaluarse con usuarios.</w:t>
+        <w:t>Es una referencia de cuánto costaría reunir los materiales incluidos. El gasto real se comprueba con facturas y descontando lo que ya tenemos. Por eso separamos precios consultados de valores estimados.</w:t>
       </w:r>
     </w:p>
     <w:p>
@@ -1124,7 +1230,7 @@
         <w:rPr>
           <w:b/>
         </w:rPr>
-        <w:t>Diapositiva 3   01:05–02:00</w:t>
+        <w:t>¿Diez dólares permiten usar cada servicio durante un mes?</w:t>
       </w:r>
     </w:p>
     <w:p>
@@ -1132,72 +1238,7 @@
         <w:rPr>
           <w:b w:val="0"/>
         </w:rPr>
-        <w:t>La viabilidad financiera parte de reutilizar recursos disponibles y comprar solo los faltantes. El presupuesto de reposición consultado suma aproximadamente un millón noventa mil pesos, con accesorios y diez por ciento de reserva. Los tres motores con sus drivers cuestan cincuenta y un mil pesos; las dos recargas de diez dólares equivalen juntas a sesenta y tres mil novecientos cincuenta y tres pesos con la TRM consultada. Las recargas son saldo de pruebas, no mensualidades fijas. Pantalla y audio reutilizados quedan fuera de esa cifra. Para calcular el desembolso real, cruzaremos inventario y comprobantes. Ahora explicaremos cómo ARIA interpreta la voz.</w:t>
-      </w:r>
-    </w:p>
-    <w:p>
-      <w:pPr>
-        <w:pStyle w:val="Heading2"/>
-      </w:pPr>
-      <w:r>
-        <w:t>Preguntas técnicas para ensayar</w:t>
-      </w:r>
-    </w:p>
-    <w:p>
-      <w:pPr>
-        <w:keepNext/>
-      </w:pPr>
-      <w:r>
-        <w:rPr>
-          <w:b/>
-        </w:rPr>
-        <w:t>¿Ese millón noventa mil pesos es lo que gastaron?</w:t>
-      </w:r>
-    </w:p>
-    <w:p>
-      <w:r>
-        <w:rPr>
-          <w:b w:val="0"/>
-        </w:rPr>
-        <w:t>Es un presupuesto de reposición, no una suma de facturas. Incluye referencias públicas y estimaciones marcadas. El gasto ejecutado requiere inventario y comprobantes; los componentes reutilizados se descuentan del desembolso.</w:t>
-      </w:r>
-    </w:p>
-    <w:p>
-      <w:pPr>
-        <w:keepNext/>
-      </w:pPr>
-      <w:r>
-        <w:rPr>
-          <w:b/>
-        </w:rPr>
-        <w:t>¿Quién se beneficia y cómo medirían el impacto?</w:t>
-      </w:r>
-    </w:p>
-    <w:p>
-      <w:r>
-        <w:rPr>
-          <w:b w:val="0"/>
-        </w:rPr>
-        <w:t>El primer uso propuesto es educativo: relacionar voz, programación, geometría y movimiento. Mediríamos comprensión, tiempo de preparación, solicitudes completadas y satisfacción con estudiantes y docentes. La accesibilidad es una línea por evaluar con usuarios.</w:t>
-      </w:r>
-    </w:p>
-    <w:p>
-      <w:pPr>
-        <w:keepNext/>
-      </w:pPr>
-      <w:r>
-        <w:rPr>
-          <w:b/>
-        </w:rPr>
-        <w:t>¿Cuánto duran las recargas?</w:t>
-      </w:r>
-    </w:p>
-    <w:p>
-      <w:r>
-        <w:rPr>
-          <w:b w:val="0"/>
-        </w:rPr>
-        <w:t>Depende del modelo, longitud de audio, respuestas y uso. Se presupuestan USD10 por proveedor como saldo inicial; no garantizan un mes ni un número fijo de conversaciones.</w:t>
+        <w:t>No podemos prometer un mes. Es un saldo inicial de pruebas. Se consume según la cantidad de audio, las respuestas y el modelo utilizado.</w:t>
       </w:r>
     </w:p>
     <w:p>
@@ -1218,7 +1259,15 @@
         <w:rPr>
           <w:b/>
         </w:rPr>
-        <w:t>Intervención 2   02:00–04:00   Diapositivas 4, 5   221 palabras</w:t>
+        <w:t>Intervención 2   02:00–04:00   Diapositivas 4, 5</w:t>
+      </w:r>
+    </w:p>
+    <w:p>
+      <w:r>
+        <w:rPr>
+          <w:b w:val="0"/>
+        </w:rPr>
+        <w:t>Propósito del rol: Explicar la conversación del asistente y cómo usamos Codex para ayudar a programar.</w:t>
       </w:r>
     </w:p>
     <w:p>
@@ -1226,7 +1275,67 @@
         <w:pStyle w:val="Heading2"/>
       </w:pPr>
       <w:r>
-        <w:t>Discurso oral</w:t>
+        <w:t>Diapositiva 4 De la voz a la respuesta</w:t>
+      </w:r>
+    </w:p>
+    <w:p>
+      <w:pPr>
+        <w:keepNext/>
+        <w:spacing w:after="80"/>
+      </w:pPr>
+      <w:r>
+        <w:rPr>
+          <w:b w:val="0"/>
+          <w:i/>
+          <w:sz w:val="19"/>
+        </w:rPr>
+        <w:t>02:00–03:00</w:t>
+      </w:r>
+    </w:p>
+    <w:p>
+      <w:r>
+        <w:rPr>
+          <w:b w:val="0"/>
+        </w:rPr>
+        <w:t>La Raspberry Pi es un computador pequeño que coordina el asistente. Primero escucha la activación; después OpenAI ayuda a convertir la voz en texto y a entender la petición. ElevenLabs convierte la respuesta escrita en una voz que podemos oír. El programa también muestra expresiones en el rostro. Para conectar esos servicios usamos una API: una conexión que permite a un programa pedir una función a otro. Si pedimos un dibujo, el programa local prepara su recorrido. Antes de mover el mecanismo, comprueba que el trabajo cumpla las condiciones del equipo. Una respuesta de la inteligencia artificial necesita esa revisión.</w:t>
+      </w:r>
+    </w:p>
+    <w:p>
+      <w:pPr>
+        <w:pStyle w:val="Heading2"/>
+      </w:pPr>
+      <w:r>
+        <w:t>Diapositiva 5 Programación con ayuda de Codex</w:t>
+      </w:r>
+    </w:p>
+    <w:p>
+      <w:pPr>
+        <w:keepNext/>
+        <w:spacing w:after="80"/>
+      </w:pPr>
+      <w:r>
+        <w:rPr>
+          <w:b w:val="0"/>
+          <w:i/>
+          <w:sz w:val="19"/>
+        </w:rPr>
+        <w:t>03:00–04:00</w:t>
+      </w:r>
+    </w:p>
+    <w:p>
+      <w:r>
+        <w:rPr>
+          <w:b w:val="0"/>
+        </w:rPr>
+        <w:t>Para construir el programa utilizamos ayuda de Codex, una herramienta de inteligencia artificial para trabajar con código. Le explicamos el equipo disponible y lo que necesitábamos. Esa solicitud escrita se llama prompt. Por ejemplo: «Tenemos un Arduino Uno R3, tres motores y una Raspberry. Ayúdanos a revisar el programa sin quitar las comprobaciones de seguridad». También indicamos las librerías, que son paquetes de funciones ya hechas, y revisamos que fueran compatibles. Comprobamos las propuestas antes de aceptarlas. La ayuda no reemplaza conocer los cables, el mecanismo ni las pruebas. Codex apoyó la programación; OpenAI y ElevenLabs forman parte de la conversación de ARIA. Mi compañero mostrará ahora los componentes.</w:t>
+      </w:r>
+    </w:p>
+    <w:p>
+      <w:pPr>
+        <w:pStyle w:val="Heading2"/>
+      </w:pPr>
+      <w:r>
+        <w:t>Preguntas del jurado para ensayar</w:t>
       </w:r>
     </w:p>
     <w:p>
@@ -1237,7 +1346,7 @@
         <w:rPr>
           <w:b/>
         </w:rPr>
-        <w:t>Diapositiva 4   02:00–02:55</w:t>
+        <w:t>¿Qué es un prompt?</w:t>
       </w:r>
     </w:p>
     <w:p>
@@ -1245,7 +1354,7 @@
         <w:rPr>
           <w:b w:val="0"/>
         </w:rPr>
-        <w:t>ARIA reparte el trabajo entre procesamiento local y servicios en la nube. Vosk reconoce localmente la activación. Después, OpenAI transcribe la voz y el modelo de conversación interpreta la petición. ElevenLabs convierte la respuesta en audio, mientras el rostro ofrece una señal visual de interacción. La Raspberry Pi coordina estos pasos. Para el CNC, el programa local transforma textos, figuras o funciones en trazos, genera G-code y valida el recorrido. El Arduino recibe instrucciones ya estructuradas. Por eso, una respuesta del modelo no se convierte directamente en impulsos eléctricos: antes pasa por controles concretos del sistema.</w:t>
+        <w:t>Es la instrucción que escribimos a una herramienta de inteligencia artificial. Para que ayude, le decimos qué tenemos, qué queremos conseguir y qué condiciones debe respetar.</w:t>
       </w:r>
     </w:p>
     <w:p>
@@ -1256,7 +1365,7 @@
         <w:rPr>
           <w:b/>
         </w:rPr>
-        <w:t>Diapositiva 5   02:55–04:00</w:t>
+        <w:t>La guía menciona Gemini. ¿Cuál utilizaron ustedes?</w:t>
       </w:r>
     </w:p>
     <w:p>
@@ -1264,15 +1373,7 @@
         <w:rPr>
           <w:b w:val="0"/>
         </w:rPr>
-        <w:t>La programación asistida exige describir el equipo y el resultado esperado. Mostramos un ejemplo reproducible de prompt: «Ayúdame a revisar un controlador para Arduino Uno, con tres motores 28BYJ-48 y drivers ULN2003. Distingue el firmware del programa Python de la Raspberry. Conserva los límites y no habilites movimiento sin referencia física. Entrega cambios pequeños y pruebas». Este ejemplo permite ensayar programación asistida en Gemini. La integración de ARIA utiliza OpenAI y ElevenLabs, con las funciones que acabamos de explicar. El trabajo del equipo consiste en revisar supuestos, contrastar el código y comprobar las respuestas. Los registros documentan doscientas noventa y nueve pruebas y dieciséis casos semánticos. Estas verificaciones respaldan funciones específicas; la calidad del contacto del lápiz requiere observación física. Mi compañero mostrará los componentes.</w:t>
-      </w:r>
-    </w:p>
-    <w:p>
-      <w:pPr>
-        <w:pStyle w:val="Heading2"/>
-      </w:pPr>
-      <w:r>
-        <w:t>Preguntas técnicas para ensayar</w:t>
+        <w:t>En este proyecto explicamos la ayuda real de Codex para programar. La guía propone Gemini como ejemplo de programación asistida. No afirmamos haber usado una herramienta si no tenemos evidencia de ello.</w:t>
       </w:r>
     </w:p>
     <w:p>
@@ -1283,7 +1384,7 @@
         <w:rPr>
           <w:b/>
         </w:rPr>
-        <w:t>¿El prompt mostrado es una captura de lo que usaron originalmente?</w:t>
+        <w:t>¿La inteligencia artificial manda directamente los motores?</w:t>
       </w:r>
     </w:p>
     <w:p>
@@ -1291,7 +1392,7 @@
         <w:rPr>
           <w:b w:val="0"/>
         </w:rPr>
-        <w:t>Es un ejemplo reproducible preparado para explicar la técnica. Los prompts históricos no están acreditados con capturas en el material disponible. Podemos demostrar su uso, identificando la sesión y el resultado nuevos.</w:t>
+        <w:t>No. El programa prepara un recorrido, comprueba sus límites y revisa las condiciones del equipo antes de enviarlo al Arduino. La respuesta de la conversación pasa por esas comprobaciones.</w:t>
       </w:r>
     </w:p>
     <w:p>
@@ -1302,7 +1403,7 @@
         <w:rPr>
           <w:b/>
         </w:rPr>
-        <w:t>¿Por qué aparecen OpenAI y ElevenLabs si la guía menciona Gemini?</w:t>
+        <w:t>¿Para qué se necesitan OpenAI y ElevenLabs?</w:t>
       </w:r>
     </w:p>
     <w:p>
@@ -1310,26 +1411,7 @@
         <w:rPr>
           <w:b w:val="0"/>
         </w:rPr>
-        <w:t>Son niveles distintos: la guía propone Gemini para ayudar a programar; la integración verificada de ARIA usa OpenAI para transcripción y conversación y ElevenLabs para síntesis de voz. No hay evidencia para atribuir a Gemini el funcionamiento del asistente.</w:t>
-      </w:r>
-    </w:p>
-    <w:p>
-      <w:pPr>
-        <w:keepNext/>
-      </w:pPr>
-      <w:r>
-        <w:rPr>
-          <w:b/>
-        </w:rPr>
-        <w:t>¿Cómo evitan que una respuesta incorrecta mueva el robot?</w:t>
-      </w:r>
-    </w:p>
-    <w:p>
-      <w:r>
-        <w:rPr>
-          <w:b w:val="0"/>
-        </w:rPr>
-        <w:t>Las herramientas exponen acciones definidas. El programa genera y valida trayectorias, área y velocidades; el movimiento requiere referencias físicas vigentes. El modelo no puede crear una referencia Z por sí solo.</w:t>
+        <w:t>OpenAI ayuda a pasar la voz a texto y a interpretar la petición. ElevenLabs transforma la respuesta escrita en voz. La Raspberry reúne esas funciones con el resto del programa.</w:t>
       </w:r>
     </w:p>
     <w:p>
@@ -1350,7 +1432,15 @@
         <w:rPr>
           <w:b/>
         </w:rPr>
-        <w:t>Intervención 3   04:00–06:00   Diapositivas 6, 7   228 palabras</w:t>
+        <w:t>Intervención 3   04:00–06:00   Diapositivas 6, 7</w:t>
+      </w:r>
+    </w:p>
+    <w:p>
+      <w:r>
+        <w:rPr>
+          <w:b w:val="0"/>
+        </w:rPr>
+        <w:t>Propósito del rol: Mostrar las piezas físicas y explicar la función de los tres motores.</w:t>
       </w:r>
     </w:p>
     <w:p>
@@ -1358,7 +1448,67 @@
         <w:pStyle w:val="Heading2"/>
       </w:pPr>
       <w:r>
-        <w:t>Discurso oral</w:t>
+        <w:t>Diapositiva 6 Componentes del proyecto</w:t>
+      </w:r>
+    </w:p>
+    <w:p>
+      <w:pPr>
+        <w:keepNext/>
+        <w:spacing w:after="80"/>
+      </w:pPr>
+      <w:r>
+        <w:rPr>
+          <w:b w:val="0"/>
+          <w:i/>
+          <w:sz w:val="19"/>
+        </w:rPr>
+        <w:t>04:00–05:00</w:t>
+      </w:r>
+    </w:p>
+    <w:p>
+      <w:r>
+        <w:rPr>
+          <w:b w:val="0"/>
+        </w:rPr>
+        <w:t>Hardware significa las piezas físicas del proyecto. La Raspberry Pi 4B ejecuta el asistente. El Arduino Uno R3 es una placa que recibe instrucciones y controla el mecanismo. Una pantalla OLED, que es una pantalla pequeña, muestra el rostro. El micrófono recoge la voz y la salida de audio reproduce la respuesta. La protoboard es la base de agujeros que permite unir cables sin soldarlos. Los jumpers son los cables pequeños de conexión. También hay interruptores de final de recorrido: avisan cuando una parte llega a un extremo. Una columna impresa sostiene la pantalla. El enfriador de la Raspberry combina piezas de metal y un ventilador para ayudar a sacar calor.</w:t>
+      </w:r>
+    </w:p>
+    <w:p>
+      <w:pPr>
+        <w:pStyle w:val="Heading2"/>
+      </w:pPr>
+      <w:r>
+        <w:t>Diapositiva 7 Los tres motores</w:t>
+      </w:r>
+    </w:p>
+    <w:p>
+      <w:pPr>
+        <w:keepNext/>
+        <w:spacing w:after="80"/>
+      </w:pPr>
+      <w:r>
+        <w:rPr>
+          <w:b w:val="0"/>
+          <w:i/>
+          <w:sz w:val="19"/>
+        </w:rPr>
+        <w:t>05:00–06:00</w:t>
+      </w:r>
+    </w:p>
+    <w:p>
+      <w:r>
+        <w:rPr>
+          <w:b w:val="0"/>
+        </w:rPr>
+        <w:t>Utilizamos tres motores paso a paso. Se llaman así porque giran en pequeños avances que el programa puede ordenar. Son del modelo 28BYJ-48 y trabajan con cinco voltios. Cada uno usa una placa ULN2003, llamada controlador o driver, que activa sus bobinas, las partes eléctricas que producen el giro. Dos motores ubican el lápiz sobre la superficie: uno controla una dirección y el otro, la dirección cruzada. Las llamamos X y Y, como en una cuadrícula. El tercer motor, al que llamamos Z, gira el portalápiz para acercar o separar la punta. Aquí ese tercer movimiento es un giro, no una altura medida en milímetros. Ahora veremos las conexiones.</w:t>
+      </w:r>
+    </w:p>
+    <w:p>
+      <w:pPr>
+        <w:pStyle w:val="Heading2"/>
+      </w:pPr>
+      <w:r>
+        <w:t>Preguntas del jurado para ensayar</w:t>
       </w:r>
     </w:p>
     <w:p>
@@ -1369,7 +1519,7 @@
         <w:rPr>
           <w:b/>
         </w:rPr>
-        <w:t>Diapositiva 6   04:00–04:55</w:t>
+        <w:t>¿Por qué hay dos placas principales?</w:t>
       </w:r>
     </w:p>
     <w:p>
@@ -1377,7 +1527,7 @@
         <w:rPr>
           <w:b w:val="0"/>
         </w:rPr>
-        <w:t>Estos son los componentes principales. La Raspberry Pi 4B ejecuta el asistente y coordina audio y solicitudes. El Arduino Uno controla el CNC. La pantalla OLED SSD1306, de ciento veintiocho por sesenta y cuatro píxeles, muestra el rostro. El audio utiliza dispositivos USB. La protoboard permite distribuir conexiones durante el prototipado y los jumpers enlazan las placas. Los finales de carrera informan sobre los extremos de los recorridos. Las placas incluyen indicadores LED para observar alimentación y actividad; cada señal debe interpretarse junto con el estado del programa. Los componentes electrónicos están sujetos a una estructura impresa en tres dimensiones.</w:t>
+        <w:t>La Raspberry hace el trabajo de conversación y prepara las solicitudes. El Arduino se ocupa del control del mecanismo. Cada placa tiene una tarea distinta dentro del mismo proyecto.</w:t>
       </w:r>
     </w:p>
     <w:p>
@@ -1388,7 +1538,7 @@
         <w:rPr>
           <w:b/>
         </w:rPr>
-        <w:t>Diapositiva 7   04:55–06:00</w:t>
+        <w:t>¿Por qué un motor necesita un driver?</w:t>
       </w:r>
     </w:p>
     <w:p>
@@ -1396,15 +1546,7 @@
         <w:rPr>
           <w:b w:val="0"/>
         </w:rPr>
-        <w:t>Los actuadores del CNC son tres motores paso a paso 28BYJ-48 de cinco voltios, cada uno acompañado por un driver ULN2003. El driver conmuta las bobinas siguiendo la secuencia ordenada por el controlador. Dos movimientos definen la posición en el plano: X y Y. El tercero gira el mecanismo del portalápiz para separar o acercar la punta. En este montaje, Z es rotatorio: sus valores del controlador no representan milímetros físicos de altura. Los pasos proporcionan movimiento incremental, pero holgura, fricción y fijación influyen en el trazo. Por eso necesitamos medir recorridos y revisar el acoplamiento, además del código. La referencia medida de X e Y es de sesenta y uno coma siete por setenta y dos coma cinco milímetros aproximadamente. Sigue la explicación de conexiones y seguridad.</w:t>
-      </w:r>
-    </w:p>
-    <w:p>
-      <w:pPr>
-        <w:pStyle w:val="Heading2"/>
-      </w:pPr>
-      <w:r>
-        <w:t>Preguntas técnicas para ensayar</w:t>
+        <w:t>Porque una salida del Arduino sirve para dar una señal y no debe alimentar por sí sola las bobinas del motor. El driver activa esas bobinas usando la alimentación correspondiente.</w:t>
       </w:r>
     </w:p>
     <w:p>
@@ -1415,7 +1557,7 @@
         <w:rPr>
           <w:b/>
         </w:rPr>
-        <w:t>¿Por qué necesitan el ULN2003 si ya tienen Arduino?</w:t>
+        <w:t>¿Qué hace el tercer motor?</w:t>
       </w:r>
     </w:p>
     <w:p>
@@ -1423,7 +1565,7 @@
         <w:rPr>
           <w:b w:val="0"/>
         </w:rPr>
-        <w:t>Los pines del Arduino producen señales de control y no deben alimentar directamente las bobinas. El ULN2003 conmuta la corriente de las bobinas del motor desde su alimentación externa.</w:t>
+        <w:t>Gira el soporte del lápiz. Sirve para separar los desplazamientos de los momentos en que queremos trazar. Su posición debe comprobarse físicamente antes de usarlo sobre papel.</w:t>
       </w:r>
     </w:p>
     <w:p>
@@ -1434,7 +1576,7 @@
         <w:rPr>
           <w:b/>
         </w:rPr>
-        <w:t>¿Z es el tercer desplazamiento lineal?</w:t>
+        <w:t>¿Para qué sirven la columna y el enfriador?</w:t>
       </w:r>
     </w:p>
     <w:p>
@@ -1442,26 +1584,7 @@
         <w:rPr>
           <w:b w:val="0"/>
         </w:rPr>
-        <w:t>En este mecanismo el tercer motor gira el portalápiz. Las coordenadas Z son unidades del controlador para ese movimiento rotatorio. No se deben presentar como milímetros de elevación física sin una conversión medida.</w:t>
-      </w:r>
-    </w:p>
-    <w:p>
-      <w:pPr>
-        <w:keepNext/>
-      </w:pPr>
-      <w:r>
-        <w:rPr>
-          <w:b/>
-        </w:rPr>
-        <w:t>¿Qué limita la precisión?</w:t>
-      </w:r>
-    </w:p>
-    <w:p>
-      <w:r>
-        <w:rPr>
-          <w:b w:val="0"/>
-        </w:rPr>
-        <w:t>La reducción y los pasos del motor, la escala pasos por milímetro, la fricción, la holgura de engranajes y guías y la sujeción del lápiz. El área medida no equivale por sí sola a una precisión garantizada.</w:t>
+        <w:t>La columna mantiene la pantalla del rostro elevada y visible. El enfriador ayuda a sacar calor de la Raspberry con metal y un ventilador. No hemos presentado una medición de temperatura ni de rendimiento.</w:t>
       </w:r>
     </w:p>
     <w:p>
@@ -1482,7 +1605,15 @@
         <w:rPr>
           <w:b/>
         </w:rPr>
-        <w:t>Intervención 4   06:00–08:00   Diapositivas 8, 9   235 palabras</w:t>
+        <w:t>Intervención 4   06:00–08:00   Diapositivas 8, 9</w:t>
+      </w:r>
+    </w:p>
+    <w:p>
+      <w:r>
+        <w:rPr>
+          <w:b w:val="0"/>
+        </w:rPr>
+        <w:t>Propósito del rol: Explicar cómo se comunican las piezas y qué revisamos para trabajar con seguridad.</w:t>
       </w:r>
     </w:p>
     <w:p>
@@ -1490,7 +1621,67 @@
         <w:pStyle w:val="Heading2"/>
       </w:pPr>
       <w:r>
-        <w:t>Discurso oral</w:t>
+        <w:t>Diapositiva 8 Conexiones y comunicación</w:t>
+      </w:r>
+    </w:p>
+    <w:p>
+      <w:pPr>
+        <w:keepNext/>
+        <w:spacing w:after="80"/>
+      </w:pPr>
+      <w:r>
+        <w:rPr>
+          <w:b w:val="0"/>
+          <w:i/>
+          <w:sz w:val="19"/>
+        </w:rPr>
+        <w:t>06:00–07:00</w:t>
+      </w:r>
+    </w:p>
+    <w:p>
+      <w:r>
+        <w:rPr>
+          <w:b w:val="0"/>
+        </w:rPr>
+        <w:t>La Raspberry se conecta al Arduino por un cable USB. Dentro de ese enlace usan comunicación serial: envían instrucciones y respuestas una detrás de otra. La pantalla utiliza I2C, una forma de comunicación con una línea de datos y otra que marca el ritmo del envío. Los cables del Arduino llevan señales a los controladores de los motores. Los motores tienen una fuente externa de cinco voltios. La Raspberry tiene su propia alimentación. La referencia de tierra une el circuito de control con el de los motores; sirve como punto común para interpretar las señales. Revisamos las conexiones con el esquema antes de encender.</w:t>
+      </w:r>
+    </w:p>
+    <w:p>
+      <w:pPr>
+        <w:pStyle w:val="Heading2"/>
+      </w:pPr>
+      <w:r>
+        <w:t>Diapositiva 9 Calibración y seguridad</w:t>
+      </w:r>
+    </w:p>
+    <w:p>
+      <w:pPr>
+        <w:keepNext/>
+        <w:spacing w:after="80"/>
+      </w:pPr>
+      <w:r>
+        <w:rPr>
+          <w:b w:val="0"/>
+          <w:i/>
+          <w:sz w:val="19"/>
+        </w:rPr>
+        <w:t>07:00–08:00</w:t>
+      </w:r>
+    </w:p>
+    <w:p>
+      <w:r>
+        <w:rPr>
+          <w:b w:val="0"/>
+        </w:rPr>
+        <w:t>Calibrar significa comprobar que lo que pide el programa corresponde con el movimiento real. Revisamos el sentido de los motores, los interruptores de los extremos y el espacio disponible. El recorrido medido es de unos seis por siete centímetros. Dejamos un margen para no trabajar pegados a los bordes. Antes de usar el lápiz hay que comprobar su posición y que el mecanismo esté despejado. Si aparece una alarma, detenemos el trabajo y revisamos qué pasó. No quitamos la advertencia solo para continuar. Durante la demostración mostraremos el estado y un diseño preparado. El desarrollador explicará cómo el programa toma esas decisiones.</w:t>
+      </w:r>
+    </w:p>
+    <w:p>
+      <w:pPr>
+        <w:pStyle w:val="Heading2"/>
+      </w:pPr>
+      <w:r>
+        <w:t>Preguntas del jurado para ensayar</w:t>
       </w:r>
     </w:p>
     <w:p>
@@ -1501,7 +1692,7 @@
         <w:rPr>
           <w:b/>
         </w:rPr>
-        <w:t>Diapositiva 8   06:00–06:55</w:t>
+        <w:t>¿Qué significan X y Y?</w:t>
       </w:r>
     </w:p>
     <w:p>
@@ -1509,7 +1700,7 @@
         <w:rPr>
           <w:b w:val="0"/>
         </w:rPr>
-        <w:t>La Raspberry y el Arduino se comunican por USB mediante una interfaz serial. Por ese enlace viajan comandos y respuestas de estado. La pantalla OLED utiliza el bus I2C; sus líneas transportan reloj y datos. Los drivers de los motores reciben señales digitales del Arduino. Sus motores usan una fuente externa de cinco voltios y comparten referencia de tierra con el controlador. La Raspberry tiene su propia alimentación adecuada. Así separamos la energía de las cargas y las señales de control. Antes de energizar revisamos polaridad, continuidad y conectores. Los pines concretos se consultan en el esquema vigente, porque el firmware y las conexiones deben coincidir.</w:t>
+        <w:t>Son los nombres de las dos direcciones sobre la superficie de trabajo. Son como las dos direcciones de una cuadrícula: una permite moverse a un lado y la otra cruza ese movimiento.</w:t>
       </w:r>
     </w:p>
     <w:p>
@@ -1520,7 +1711,7 @@
         <w:rPr>
           <w:b/>
         </w:rPr>
-        <w:t>Diapositiva 9   06:55–08:00</w:t>
+        <w:t>¿Qué hacen los finales de recorrido?</w:t>
       </w:r>
     </w:p>
     <w:p>
@@ -1528,15 +1719,7 @@
         <w:rPr>
           <w:b w:val="0"/>
         </w:rPr>
-        <w:t>La calibración identifica la geometría de trabajo y comprueba los sensores. El registro más reciente verificó un área de sesenta y uno coma seis nueve nueve por setenta y dos coma cuatro ocho ocho milímetros. Con margen de tres milímetros en cada lado, el espacio disponible para el diseño se reduce. Los finales de carrera están configurados como contactos normalmente cerrados, de modo que el controlador puede supervisar su estado. También debemos confirmar la referencia del portalápiz en la sesión y mantener la punta apartada durante traslados. Una alarma exige revisar la causa antes de continuar. Durante la sustentación solo se mueve el equipo si la preparación física está verificada; consultar el estado o previsualizar un trabajo permite explicar el flujo sin ejecutar trayectorias. El desarrollador explicará esa lógica.</w:t>
-      </w:r>
-    </w:p>
-    <w:p>
-      <w:pPr>
-        <w:pStyle w:val="Heading2"/>
-      </w:pPr>
-      <w:r>
-        <w:t>Preguntas técnicas para ensayar</w:t>
+        <w:t>Son interruptores que informan sobre los extremos del mecanismo. En este montaje el circuito está cerrado en reposo. Al cambiar ese estado, el programa debe revisar la situación y aplicar su control de límites.</w:t>
       </w:r>
     </w:p>
     <w:p>
@@ -1547,7 +1730,7 @@
         <w:rPr>
           <w:b/>
         </w:rPr>
-        <w:t>¿Qué buses usan realmente?</w:t>
+        <w:t>¿Usan SPI o relés?</w:t>
       </w:r>
     </w:p>
     <w:p>
@@ -1555,7 +1738,7 @@
         <w:rPr>
           <w:b w:val="0"/>
         </w:rPr>
-        <w:t>USB serial entre Raspberry y Arduino e I2C para el OLED. Las entradas de límites y señales al ULN2003 son digitales. No atribuimos SPI ni Bluetooth al enlace CNC sin evidencia en la configuración actual.</w:t>
+        <w:t>En el enlace explicado usamos USB serial y, para la pantalla, I2C. No necesitamos atribuir al CNC todos los componentes y conexiones que la guía menciona como ejemplos de otros proyectos.</w:t>
       </w:r>
     </w:p>
     <w:p>
@@ -1566,7 +1749,7 @@
         <w:rPr>
           <w:b/>
         </w:rPr>
-        <w:t>¿Por qué usan finales normalmente cerrados?</w:t>
+        <w:t>¿Por qué no conectan los motores directamente a la Raspberry?</w:t>
       </w:r>
     </w:p>
     <w:p>
@@ -1574,26 +1757,7 @@
         <w:rPr>
           <w:b w:val="0"/>
         </w:rPr>
-        <w:t>Permiten supervisar un circuito cerrado en reposo. Un accionamiento o una apertura de cable cambia el estado observado. El software debe tratarlo según su lógica de límites; no basta conectar el interruptor.</w:t>
-      </w:r>
-    </w:p>
-    <w:p>
-      <w:pPr>
-        <w:keepNext/>
-      </w:pPr>
-      <w:r>
-        <w:rPr>
-          <w:b/>
-        </w:rPr>
-        <w:t>¿Pueden calibrar ahora frente al jurado?</w:t>
-      </w:r>
-    </w:p>
-    <w:p>
-      <w:r>
-        <w:rPr>
-          <w:b w:val="0"/>
-        </w:rPr>
-        <w:t>Solo después de la revisión física y la autorización del operador, con mecanismo despejado y referencias compatibles. Este guion no ejecuta calibración; el ensayo de presentación utiliza consultas y vistas previas. Si una referencia falta, se detiene la demostración de movimiento.</w:t>
+        <w:t>Porque la Raspberry coordina la conversación y sus salidas no están para alimentar las bobinas. El Arduino envía las señales de control y cada ULN2003 activa su motor con la fuente adecuada.</w:t>
       </w:r>
     </w:p>
     <w:p>
@@ -1614,7 +1778,15 @@
         <w:rPr>
           <w:b/>
         </w:rPr>
-        <w:t>Intervención 5   08:00–10:00   Diapositivas 10, 11   229 palabras</w:t>
+        <w:t>Intervención 5   08:00–10:00   Diapositivas 10, 11</w:t>
+      </w:r>
+    </w:p>
+    <w:p>
+      <w:r>
+        <w:rPr>
+          <w:b w:val="0"/>
+        </w:rPr>
+        <w:t>Propósito del rol: Explicar el programa, sus comprobaciones y un problema real del proceso.</w:t>
       </w:r>
     </w:p>
     <w:p>
@@ -1622,7 +1794,67 @@
         <w:pStyle w:val="Heading2"/>
       </w:pPr>
       <w:r>
-        <w:t>Discurso oral</w:t>
+        <w:t>Diapositiva 10 Cómo trabaja el programa</w:t>
+      </w:r>
+    </w:p>
+    <w:p>
+      <w:pPr>
+        <w:keepNext/>
+        <w:spacing w:after="80"/>
+      </w:pPr>
+      <w:r>
+        <w:rPr>
+          <w:b w:val="0"/>
+          <w:i/>
+          <w:sz w:val="19"/>
+        </w:rPr>
+        <w:t>08:00–09:00</w:t>
+      </w:r>
+    </w:p>
+    <w:p>
+      <w:r>
+        <w:rPr>
+          <w:b w:val="0"/>
+        </w:rPr>
+        <w:t>El software es el conjunto de instrucciones del equipo. En la Raspberry usamos Python, un lenguaje para escribir programas. Allí se coordinan la conversación y los dibujos. En el Arduino hay un firmware: el programa cargado en la placa. Está adaptado de GRBL, un programa de control de movimiento escrito en C, otro lenguaje de programación. Recibe código G, que son órdenes como ir a una posición. Al arrancar, prepara sus conexiones; después sigue revisando las instrucciones y el estado del mecanismo. Las variables guardan datos, por ejemplo la posición. Las condiciones permiten decidir: si falta una referencia o hay una alarma, el trabajo no debe empezar.</w:t>
+      </w:r>
+    </w:p>
+    <w:p>
+      <w:pPr>
+        <w:pStyle w:val="Heading2"/>
+      </w:pPr>
+      <w:r>
+        <w:t>Diapositiva 11 Problema y revisión del resultado</w:t>
+      </w:r>
+    </w:p>
+    <w:p>
+      <w:pPr>
+        <w:keepNext/>
+        <w:spacing w:after="80"/>
+      </w:pPr>
+      <w:r>
+        <w:rPr>
+          <w:b w:val="0"/>
+          <w:i/>
+          <w:sz w:val="19"/>
+        </w:rPr>
+        <w:t>09:00–10:00</w:t>
+      </w:r>
+    </w:p>
+    <w:p>
+      <w:r>
+        <w:rPr>
+          <w:b w:val="0"/>
+        </w:rPr>
+        <w:t>Un problema real apareció al medir el recorrido. El sistema comparó dos mediciones que no coincidían y mostró la alarma nueve. Rechazó el resultado en vez de darlo por correcto. Revisamos el manejo de los interruptores y las condiciones de arranque del programa. Después quedó registrada una medición válida y una prueba de movimiento para la palabra «HOLA», sin lápiz. Esa prueba comprueba una parte del funcionamiento; todavía debemos demostrar el contacto y la escritura sobre papel. La causa física de la diferencia anterior no quedó confirmada. Depurar significa revisar un problema, cambiar algo concreto y volver a comprobar. El maquetador cerrará con el armado y la demostración.</w:t>
+      </w:r>
+    </w:p>
+    <w:p>
+      <w:pPr>
+        <w:pStyle w:val="Heading2"/>
+      </w:pPr>
+      <w:r>
+        <w:t>Preguntas del jurado para ensayar</w:t>
       </w:r>
     </w:p>
     <w:p>
@@ -1633,7 +1865,7 @@
         <w:rPr>
           <w:b/>
         </w:rPr>
-        <w:t>Diapositiva 10   08:00–08:55</w:t>
+        <w:t>¿Qué es una máquina de estados?</w:t>
       </w:r>
     </w:p>
     <w:p>
@@ -1641,7 +1873,7 @@
         <w:rPr>
           <w:b w:val="0"/>
         </w:rPr>
-        <w:t>El software tiene dos capas. En la Raspberry, Python administra voz, herramientas, geometría y trabajos. En el Arduino, el firmware de la familia C y C++ ejecuta el control de motores y límites. La inicialización configura entradas, salidas y comunicación; el ciclo principal procesa comandos y estados. Las variables guardan posición, límites y condiciones del trabajo. La lógica condicional decide si una solicitud puede prepararse o ejecutarse. La máquina de estados distingue espera, preparación, movimiento, parada y alarma. El programa local guarda G-code, una vista SVG y metadatos. Un archivo preparado necesita validación y condiciones físicas vigentes antes de enviarse al equipo.</w:t>
+        <w:t>Es una forma de organizar el programa según lo que está haciendo. Por ejemplo, puede estar esperando, preparando un trabajo, moviéndose o mostrando una alarma. Solo permite ciertas acciones en cada situación.</w:t>
       </w:r>
     </w:p>
     <w:p>
@@ -1652,7 +1884,7 @@
         <w:rPr>
           <w:b/>
         </w:rPr>
-        <w:t>Diapositiva 11   08:55–10:00</w:t>
+        <w:t>¿Dónde están setup y loop?</w:t>
       </w:r>
     </w:p>
     <w:p>
@@ -1660,15 +1892,7 @@
         <w:rPr>
           <w:b w:val="0"/>
         </w:rPr>
-        <w:t>Nuestro caso de depuración documentado fue una alarma nueve durante la medición, un fallo de validación física. El registro comparó sesenta coma veintitrés milímetros con sesenta y dos coma doscientos ocho: la diferencia superó la tolerancia y el sistema rechazó el resultado. Esa alarma no identifica por sí sola la causa mecánica. La versión R6 incorpora reglas para iniciar con un tope ya accionado, liberar esa condición de forma controlada y abortar ante combinaciones incompatibles. Después se registró una medición completa verificada y una prueba en seco de «HOLA». Las pruebas de software no sustituyen la validación del trazo en papel. La validación combina código, registros y observación del equipo; permite explicar lo comprobado y reconocer qué medición física falta. Cerramos con el modelo y la demostración.</w:t>
-      </w:r>
-    </w:p>
-    <w:p>
-      <w:pPr>
-        <w:pStyle w:val="Heading2"/>
-      </w:pPr>
-      <w:r>
-        <w:t>Preguntas técnicas para ensayar</w:t>
+        <w:t>Esos nombres suelen significar preparar el Arduino una vez y repetir su trabajo. Nuestro programa GRBL adaptado usa main para iniciar y protocol_main_loop para revisar instrucciones. Cumple esas tareas con nombres propios de ese programa.</w:t>
       </w:r>
     </w:p>
     <w:p>
@@ -1679,7 +1903,7 @@
         <w:rPr>
           <w:b/>
         </w:rPr>
-        <w:t>¿ALARM 9 es un error de compilación?</w:t>
+        <w:t>¿La alarma nueve fue un error de compilación?</w:t>
       </w:r>
     </w:p>
     <w:p>
@@ -1687,7 +1911,7 @@
         <w:rPr>
           <w:b w:val="0"/>
         </w:rPr>
-        <w:t>No. En el caso documentado aparece durante una medición y rechaza recorridos inconsistentes. Un error de compilación ocurre antes de cargar el firmware. No contamos con un mensaje histórico acreditado de compilación para describirlo como experiencia real.</w:t>
+        <w:t>No. Compilar significa convertir el código en un programa que la placa pueda usar. La alarma documentada ocurrió después, mientras se medía el mecanismo. No presentamos como real un error de compilación del que no tenemos un registro.</w:t>
       </w:r>
     </w:p>
     <w:p>
@@ -1698,7 +1922,7 @@
         <w:rPr>
           <w:b/>
         </w:rPr>
-        <w:t>¿R6 resolvió la causa mecánica de la alarma?</w:t>
+        <w:t>¿La modificación demostró cuál pieza estaba fallando?</w:t>
       </w:r>
     </w:p>
     <w:p>
@@ -1706,26 +1930,7 @@
         <w:rPr>
           <w:b w:val="0"/>
         </w:rPr>
-        <w:t>La causa física no quedó establecida. R6 añadió manejo controlado de un tope inicialmente activo y rechazo de conflictos. Después existe un barrido completo válido; eso no prueba por sí solo cuál pieza causó la inconsistencia anterior.</w:t>
-      </w:r>
-    </w:p>
-    <w:p>
-      <w:pPr>
-        <w:keepNext/>
-      </w:pPr>
-      <w:r>
-        <w:rPr>
-          <w:b/>
-        </w:rPr>
-        <w:t>¿Qué respaldan las 299 pruebas?</w:t>
-      </w:r>
-    </w:p>
-    <w:p>
-      <w:r>
-        <w:rPr>
-          <w:b w:val="0"/>
-        </w:rPr>
-        <w:t>El registro final informa 299 pruebas locales y 299 en la Raspberry, además de 16 casos semánticos en vivo. Respaldan los comportamientos ensayados; no certifican precisión, vida útil ni escritura física en todos los escenarios.</w:t>
+        <w:t>No quedó confirmada la causa física. Sí quedó registrada una mejora en el control de las condiciones de arranque y una medición posterior válida. Son dos afirmaciones diferentes.</w:t>
       </w:r>
     </w:p>
     <w:p>
@@ -1746,7 +1951,15 @@
         <w:rPr>
           <w:b/>
         </w:rPr>
-        <w:t>Intervención 6   10:00–12:00   Diapositivas 12, 13, 14, 15   111 palabras</w:t>
+        <w:t>Intervención 6   10:00–12:00   Diapositivas 12, 13, 14, 15</w:t>
+      </w:r>
+    </w:p>
+    <w:p>
+      <w:r>
+        <w:rPr>
+          <w:b w:val="0"/>
+        </w:rPr>
+        <w:t>Propósito del rol: Explicar cómo armamos el modelo, conducir la demostración y cerrar el propósito educativo.</w:t>
       </w:r>
     </w:p>
     <w:p>
@@ -1754,7 +1967,135 @@
         <w:pStyle w:val="Heading2"/>
       </w:pPr>
       <w:r>
-        <w:t>Discurso oral</w:t>
+        <w:t>Diapositiva 12 Del modelo al armado</w:t>
+      </w:r>
+    </w:p>
+    <w:p>
+      <w:pPr>
+        <w:keepNext/>
+        <w:spacing w:after="80"/>
+      </w:pPr>
+      <w:r>
+        <w:rPr>
+          <w:b w:val="0"/>
+          <w:i/>
+          <w:sz w:val="19"/>
+        </w:rPr>
+        <w:t>10:00–10:20</w:t>
+      </w:r>
+    </w:p>
+    <w:p>
+      <w:r>
+        <w:rPr>
+          <w:b w:val="0"/>
+        </w:rPr>
+        <w:t>Seguimos modelos existentes y revisamos sus piezas en Fusion, un programa para verlas en tres dimensiones. Las imprimimos en plástico, capa por capa, y armamos base, guías, motores y portalápiz. Luego revisamos que encajaran y se movieran.</w:t>
+      </w:r>
+    </w:p>
+    <w:p>
+      <w:pPr>
+        <w:pStyle w:val="Heading2"/>
+      </w:pPr>
+      <w:r>
+        <w:t>Diapositiva 13 Demostración</w:t>
+      </w:r>
+    </w:p>
+    <w:p>
+      <w:pPr>
+        <w:keepNext/>
+        <w:spacing w:after="80"/>
+      </w:pPr>
+      <w:r>
+        <w:rPr>
+          <w:b w:val="0"/>
+          <w:i/>
+          <w:sz w:val="19"/>
+        </w:rPr>
+        <w:t>10:20–11:35</w:t>
+      </w:r>
+    </w:p>
+    <w:p>
+      <w:r>
+        <w:rPr>
+          <w:b w:val="0"/>
+        </w:rPr>
+        <w:t>Mostraremos el estado y «HOLA». La vista previa es el dibujo preparado antes de enviarlo al mecanismo.</w:t>
+      </w:r>
+    </w:p>
+    <w:p>
+      <w:pPr>
+        <w:pStyle w:val="Heading2"/>
+      </w:pPr>
+      <w:r>
+        <w:t>Diapositiva 14 Uso e impacto</w:t>
+      </w:r>
+    </w:p>
+    <w:p>
+      <w:pPr>
+        <w:keepNext/>
+        <w:spacing w:after="80"/>
+      </w:pPr>
+      <w:r>
+        <w:rPr>
+          <w:b w:val="0"/>
+          <w:i/>
+          <w:sz w:val="19"/>
+        </w:rPr>
+        <w:t>11:35–11:50</w:t>
+      </w:r>
+    </w:p>
+    <w:p>
+      <w:r>
+        <w:rPr>
+          <w:b w:val="0"/>
+        </w:rPr>
+        <w:t>Queremos que ARIA ayude a aprender participando. Ya tenemos integración y pruebas de movimiento. Falta demostrar el trazo sobre papel y evaluar su utilidad con estudiantes.</w:t>
+      </w:r>
+    </w:p>
+    <w:p>
+      <w:pPr>
+        <w:pStyle w:val="Heading2"/>
+      </w:pPr>
+      <w:r>
+        <w:t>Diapositiva 15 Cierre</w:t>
+      </w:r>
+    </w:p>
+    <w:p>
+      <w:pPr>
+        <w:keepNext/>
+        <w:spacing w:after="80"/>
+      </w:pPr>
+      <w:r>
+        <w:rPr>
+          <w:b w:val="0"/>
+          <w:i/>
+          <w:sz w:val="19"/>
+        </w:rPr>
+        <w:t>11:50–11:58</w:t>
+      </w:r>
+    </w:p>
+    <w:p>
+      <w:r>
+        <w:rPr>
+          <w:b w:val="0"/>
+        </w:rPr>
+        <w:t>Aprendimos a construir, conectar y revisar con ayuda de la programación. ARIA: tu voz toma forma.</w:t>
+      </w:r>
+    </w:p>
+    <w:p>
+      <w:r>
+        <w:rPr>
+          <w:b w:val="0"/>
+        </w:rPr>
+        <w:t>De 10:30 a 11:35 se reservan 65 segundos para la demostración de la página siguiente. El gestor presenta el video de 11:58 a 12:00.</w:t>
+      </w:r>
+    </w:p>
+    <w:p>
+      <w:pPr>
+        <w:pStyle w:val="Heading2"/>
+      </w:pPr>
+      <w:r>
+        <w:t>Preguntas del jurado para ensayar</w:t>
       </w:r>
     </w:p>
     <w:p>
@@ -1765,7 +2106,7 @@
         <w:rPr>
           <w:b/>
         </w:rPr>
-        <w:t>Diapositiva 12   10:00–10:20</w:t>
+        <w:t>¿Diseñaron todas las piezas desde cero?</w:t>
       </w:r>
     </w:p>
     <w:p>
@@ -1773,7 +2114,7 @@
         <w:rPr>
           <w:b w:val="0"/>
         </w:rPr>
-        <w:t>El modelo disponible en Fusion permite examinar base, guías, engranajes y portalápiz. La fabricación por impresión 3D facilita adaptar soportes y reemplazar piezas. El montaje conecta esa geometría con motores y electrónica; la rigidez y la alineación son parte del funcionamiento.</w:t>
+        <w:t>No. Partimos de modelos publicados, seguimos esa base y la adaptamos al montaje. Damos crédito a sus autores. Fusion nos permite revisar el ensamblaje y explicar cómo encajan las piezas.</w:t>
       </w:r>
     </w:p>
     <w:p>
@@ -1784,7 +2125,7 @@
         <w:rPr>
           <w:b/>
         </w:rPr>
-        <w:t>Diapositiva 13   10:20–11:35</w:t>
+        <w:t>¿Qué es impresión 3D?</w:t>
       </w:r>
     </w:p>
     <w:p>
@@ -1792,7 +2133,7 @@
         <w:rPr>
           <w:b w:val="0"/>
         </w:rPr>
-        <w:t>Ahora mostraremos el estado y la preparación de un diseño. La vista previa permite revisar el resultado antes de autorizar movimiento.</w:t>
+        <w:t>Es fabricar una pieza de un archivo digital colocando material capa por capa. Aquí usamos PLA, un plástico de impresión, para formar piezas y soportes del montaje.</w:t>
       </w:r>
     </w:p>
     <w:p>
@@ -1803,7 +2144,7 @@
         <w:rPr>
           <w:b/>
         </w:rPr>
-        <w:t>Diapositiva 14   11:35–11:50</w:t>
+        <w:t>¿Ya escribe en una hoja?</w:t>
       </w:r>
     </w:p>
     <w:p>
@@ -1811,7 +2152,7 @@
         <w:rPr>
           <w:b w:val="0"/>
         </w:rPr>
-        <w:t>ARIA puede convertir una petición cotidiana en una experiencia de aprendizaje visible. Tenemos integración, área medida y ensayo en seco; el contacto y la escritura sobre papel siguen pendientes de validación física.</w:t>
+        <w:t>Tenemos el recorrido preparado y un ensayo de movimiento sin lápiz. Para afirmar que escribe en papel necesitamos comprobar el contacto de la punta y guardar esa prueba.</w:t>
       </w:r>
     </w:p>
     <w:p>
@@ -1822,7 +2163,7 @@
         <w:rPr>
           <w:b/>
         </w:rPr>
-        <w:t>Diapositiva 15   11:50–11:58</w:t>
+        <w:t>¿Qué muestran si el mecanismo no está listo?</w:t>
       </w:r>
     </w:p>
     <w:p>
@@ -1830,80 +2171,7 @@
         <w:rPr>
           <w:b w:val="0"/>
         </w:rPr>
-        <w:t>Seguiremos validando el trazo y su utilidad educativa con docentes y estudiantes. ARIA: tu voz toma forma.</w:t>
-      </w:r>
-    </w:p>
-    <w:p>
-      <w:r>
-        <w:rPr>
-          <w:b w:val="0"/>
-        </w:rPr>
-        <w:t>Pausa operativa reservada: 65 segundos para la demostración, de 10:30 a 11:35. Seguir la secuencia de la página siguiente. El gestor da paso al video al finalizar esta intervención.</w:t>
-      </w:r>
-    </w:p>
-    <w:p>
-      <w:pPr>
-        <w:pStyle w:val="Heading2"/>
-      </w:pPr>
-      <w:r>
-        <w:t>Preguntas técnicas para ensayar</w:t>
-      </w:r>
-    </w:p>
-    <w:p>
-      <w:pPr>
-        <w:keepNext/>
-      </w:pPr>
-      <w:r>
-        <w:rPr>
-          <w:b/>
-        </w:rPr>
-        <w:t>¿Diseñaron desde cero toda la mecánica?</w:t>
-      </w:r>
-    </w:p>
-    <w:p>
-      <w:r>
-        <w:rPr>
-          <w:b w:val="0"/>
-        </w:rPr>
-        <w:t>El modelo documentado deriva de Simple CNC Plotter de mith y de una publicación anterior de DAZ_projects. Debemos atribuir esa base y distinguir las adaptaciones propias. Fusion se utiliza para inspeccionar el modelo del proyecto.</w:t>
-      </w:r>
-    </w:p>
-    <w:p>
-      <w:pPr>
-        <w:keepNext/>
-      </w:pPr>
-      <w:r>
-        <w:rPr>
-          <w:b/>
-        </w:rPr>
-        <w:t>¿Ya escribe sobre papel?</w:t>
-      </w:r>
-    </w:p>
-    <w:p>
-      <w:r>
-        <w:rPr>
-          <w:b w:val="0"/>
-        </w:rPr>
-        <w:t>Hay preparación de textos y trayectorias y un ensayo en seco documentado. La evidencia final mantiene sin confirmar el contacto del lápiz. Para afirmar escritura en papel necesitamos observar y conservar esa prueba.</w:t>
-      </w:r>
-    </w:p>
-    <w:p>
-      <w:pPr>
-        <w:keepNext/>
-      </w:pPr>
-      <w:r>
-        <w:rPr>
-          <w:b/>
-        </w:rPr>
-        <w:t>¿Qué mostrarán si falta la referencia física?</w:t>
-      </w:r>
-    </w:p>
-    <w:p>
-      <w:r>
-        <w:rPr>
-          <w:b w:val="0"/>
-        </w:rPr>
-        <w:t>La consulta de estado, la vista previa de un texto o función y el modelo 3D. Se explica la condición pendiente y no se ejecutan movimientos. La demostración de preparación se distingue de una prueba de escritura física.</w:t>
+        <w:t>Mostramos el modelo, una consulta de estado o su registro identificado y el dibujo preparado. Eso permite explicar el proceso sin enviar una orden de movimiento.</w:t>
       </w:r>
     </w:p>
     <w:p>
@@ -1916,7 +2184,7 @@
         <w:pStyle w:val="Heading1"/>
       </w:pPr>
       <w:r>
-        <w:t>Demostración y ejemplo de prompt</w:t>
+        <w:t>Demostración paso a paso</w:t>
       </w:r>
     </w:p>
     <w:p>
@@ -1924,7 +2192,7 @@
         <w:rPr>
           <w:b/>
         </w:rPr>
-        <w:t>Secuencia de demostración   10:30 a 11:35   65 segundos</w:t>
+        <w:t>Diapositiva 13   10:30 a 11:35   65 segundos</w:t>
       </w:r>
     </w:p>
     <w:p>
@@ -1932,393 +2200,7 @@
         <w:rPr>
           <w:b w:val="0"/>
         </w:rPr>
-        <w:t>Esta secuencia consulta y muestra preparación. No transmite movimientos al robot. La escritura física solo puede incorporarse después de validar las condiciones actuales del equipo.</w:t>
-      </w:r>
-    </w:p>
-    <w:tbl>
-      <w:tblPr>
-        <w:tblW w:type="auto" w:w="0"/>
-        <w:jc w:val="center"/>
-        <w:tblLayout w:type="fixed"/>
-        <w:tblLook w:firstColumn="1" w:firstRow="1" w:lastColumn="0" w:lastRow="0" w:noHBand="0" w:noVBand="1" w:val="04A0"/>
-      </w:tblPr>
-      <w:tblGrid>
-        <w:gridCol w:w="1304"/>
-        <w:gridCol w:w="8561"/>
-      </w:tblGrid>
-      <w:tr>
-        <w:trPr>
-          <w:cantSplit/>
-          <w:tblHeader/>
-        </w:trPr>
-        <w:tc>
-          <w:tcPr>
-            <w:tcW w:type="dxa" w:w="1304"/>
-            <w:vAlign w:val="center"/>
-            <w:tcMar>
-              <w:top w:w="75" w:type="dxa"/>
-              <w:left w:w="95" w:type="dxa"/>
-              <w:bottom w:w="75" w:type="dxa"/>
-              <w:right w:w="95" w:type="dxa"/>
-            </w:tcMar>
-            <w:shd w:fill="193E48"/>
-            <w:tcBorders>
-              <w:top w:val="single" w:sz="4" w:color="D9D9D9"/>
-              <w:left w:val="single" w:sz="4" w:color="D9D9D9"/>
-              <w:bottom w:val="single" w:sz="4" w:color="D9D9D9"/>
-              <w:right w:val="single" w:sz="4" w:color="D9D9D9"/>
-            </w:tcBorders>
-          </w:tcPr>
-          <w:p>
-            <w:pPr>
-              <w:spacing w:after="20" w:before="20" w:line="245" w:lineRule="auto"/>
-            </w:pPr>
-            <w:r>
-              <w:rPr>
-                <w:rFonts w:ascii="Arial" w:hAnsi="Arial"/>
-                <w:b/>
-                <w:color w:val="FFFFFF"/>
-                <w:sz w:val="19"/>
-              </w:rPr>
-              <w:t>Segundos</w:t>
-            </w:r>
-          </w:p>
-        </w:tc>
-        <w:tc>
-          <w:tcPr>
-            <w:tcW w:type="dxa" w:w="8561"/>
-            <w:vAlign w:val="center"/>
-            <w:tcMar>
-              <w:top w:w="75" w:type="dxa"/>
-              <w:left w:w="95" w:type="dxa"/>
-              <w:bottom w:w="75" w:type="dxa"/>
-              <w:right w:w="95" w:type="dxa"/>
-            </w:tcMar>
-            <w:shd w:fill="193E48"/>
-            <w:tcBorders>
-              <w:top w:val="single" w:sz="4" w:color="D9D9D9"/>
-              <w:left w:val="single" w:sz="4" w:color="D9D9D9"/>
-              <w:bottom w:val="single" w:sz="4" w:color="D9D9D9"/>
-              <w:right w:val="single" w:sz="4" w:color="D9D9D9"/>
-            </w:tcBorders>
-          </w:tcPr>
-          <w:p>
-            <w:pPr>
-              <w:spacing w:after="20" w:before="20" w:line="245" w:lineRule="auto"/>
-              <w:jc w:val="center"/>
-            </w:pPr>
-            <w:r>
-              <w:rPr>
-                <w:rFonts w:ascii="Arial" w:hAnsi="Arial"/>
-                <w:b/>
-                <w:color w:val="FFFFFF"/>
-                <w:sz w:val="19"/>
-              </w:rPr>
-              <w:t>Acción del equipo</w:t>
-            </w:r>
-          </w:p>
-        </w:tc>
-      </w:tr>
-      <w:tr>
-        <w:trPr>
-          <w:cantSplit/>
-        </w:trPr>
-        <w:tc>
-          <w:tcPr>
-            <w:tcW w:type="dxa" w:w="1304"/>
-            <w:vAlign w:val="center"/>
-            <w:tcMar>
-              <w:top w:w="75" w:type="dxa"/>
-              <w:left w:w="95" w:type="dxa"/>
-              <w:bottom w:w="75" w:type="dxa"/>
-              <w:right w:w="95" w:type="dxa"/>
-            </w:tcMar>
-            <w:shd w:fill="FFFFFF"/>
-            <w:tcBorders>
-              <w:top w:val="single" w:sz="4" w:color="D9D9D9"/>
-              <w:left w:val="single" w:sz="4" w:color="D9D9D9"/>
-              <w:bottom w:val="single" w:sz="4" w:color="D9D9D9"/>
-              <w:right w:val="single" w:sz="4" w:color="D9D9D9"/>
-            </w:tcBorders>
-          </w:tcPr>
-          <w:p>
-            <w:pPr>
-              <w:spacing w:after="20" w:before="20" w:line="245" w:lineRule="auto"/>
-            </w:pPr>
-            <w:r>
-              <w:rPr>
-                <w:rFonts w:ascii="Arial" w:hAnsi="Arial"/>
-                <w:b w:val="0"/>
-                <w:color w:val="000000"/>
-                <w:sz w:val="19"/>
-              </w:rPr>
-              <w:t>0 a 15</w:t>
-            </w:r>
-          </w:p>
-        </w:tc>
-        <w:tc>
-          <w:tcPr>
-            <w:tcW w:type="dxa" w:w="8561"/>
-            <w:vAlign w:val="center"/>
-            <w:tcMar>
-              <w:top w:w="75" w:type="dxa"/>
-              <w:left w:w="95" w:type="dxa"/>
-              <w:bottom w:w="75" w:type="dxa"/>
-              <w:right w:w="95" w:type="dxa"/>
-            </w:tcMar>
-            <w:shd w:fill="FFFFFF"/>
-            <w:tcBorders>
-              <w:top w:val="single" w:sz="4" w:color="D9D9D9"/>
-              <w:left w:val="single" w:sz="4" w:color="D9D9D9"/>
-              <w:bottom w:val="single" w:sz="4" w:color="D9D9D9"/>
-              <w:right w:val="single" w:sz="4" w:color="D9D9D9"/>
-            </w:tcBorders>
-          </w:tcPr>
-          <w:p>
-            <w:pPr>
-              <w:spacing w:after="20" w:before="20" w:line="245" w:lineRule="auto"/>
-              <w:jc w:val="center"/>
-            </w:pPr>
-            <w:r>
-              <w:rPr>
-                <w:rFonts w:ascii="Arial" w:hAnsi="Arial"/>
-                <w:b w:val="0"/>
-                <w:color w:val="000000"/>
-                <w:sz w:val="19"/>
-              </w:rPr>
-              <w:t>Mostrar el modelo 3D local y señalar X, Y y giro del portalápiz. Mantener el CNC sin órdenes de movimiento.</w:t>
-            </w:r>
-          </w:p>
-        </w:tc>
-      </w:tr>
-      <w:tr>
-        <w:trPr>
-          <w:cantSplit/>
-        </w:trPr>
-        <w:tc>
-          <w:tcPr>
-            <w:tcW w:type="dxa" w:w="1304"/>
-            <w:vAlign w:val="center"/>
-            <w:tcMar>
-              <w:top w:w="75" w:type="dxa"/>
-              <w:left w:w="95" w:type="dxa"/>
-              <w:bottom w:w="75" w:type="dxa"/>
-              <w:right w:w="95" w:type="dxa"/>
-            </w:tcMar>
-            <w:shd w:fill="F1F5F5"/>
-            <w:tcBorders>
-              <w:top w:val="single" w:sz="4" w:color="D9D9D9"/>
-              <w:left w:val="single" w:sz="4" w:color="D9D9D9"/>
-              <w:bottom w:val="single" w:sz="4" w:color="D9D9D9"/>
-              <w:right w:val="single" w:sz="4" w:color="D9D9D9"/>
-            </w:tcBorders>
-          </w:tcPr>
-          <w:p>
-            <w:pPr>
-              <w:spacing w:after="20" w:before="20" w:line="245" w:lineRule="auto"/>
-            </w:pPr>
-            <w:r>
-              <w:rPr>
-                <w:rFonts w:ascii="Arial" w:hAnsi="Arial"/>
-                <w:b w:val="0"/>
-                <w:color w:val="000000"/>
-                <w:sz w:val="19"/>
-              </w:rPr>
-              <w:t>15 a 30</w:t>
-            </w:r>
-          </w:p>
-        </w:tc>
-        <w:tc>
-          <w:tcPr>
-            <w:tcW w:type="dxa" w:w="8561"/>
-            <w:vAlign w:val="center"/>
-            <w:tcMar>
-              <w:top w:w="75" w:type="dxa"/>
-              <w:left w:w="95" w:type="dxa"/>
-              <w:bottom w:w="75" w:type="dxa"/>
-              <w:right w:w="95" w:type="dxa"/>
-            </w:tcMar>
-            <w:shd w:fill="F1F5F5"/>
-            <w:tcBorders>
-              <w:top w:val="single" w:sz="4" w:color="D9D9D9"/>
-              <w:left w:val="single" w:sz="4" w:color="D9D9D9"/>
-              <w:bottom w:val="single" w:sz="4" w:color="D9D9D9"/>
-              <w:right w:val="single" w:sz="4" w:color="D9D9D9"/>
-            </w:tcBorders>
-          </w:tcPr>
-          <w:p>
-            <w:pPr>
-              <w:spacing w:after="20" w:before="20" w:line="245" w:lineRule="auto"/>
-              <w:jc w:val="center"/>
-            </w:pPr>
-            <w:r>
-              <w:rPr>
-                <w:rFonts w:ascii="Arial" w:hAnsi="Arial"/>
-                <w:b w:val="0"/>
-                <w:color w:val="000000"/>
-                <w:sz w:val="19"/>
-              </w:rPr>
-              <w:t>Mostrar consulta de estado o su registro fechado. Si ARIA está disponible y el operador lo considera viable, usar únicamente «Aria, ¿cómo está el CNC?». Aclarar si se presenta un registro y no el estado vivo.</w:t>
-            </w:r>
-          </w:p>
-        </w:tc>
-      </w:tr>
-      <w:tr>
-        <w:trPr>
-          <w:cantSplit/>
-        </w:trPr>
-        <w:tc>
-          <w:tcPr>
-            <w:tcW w:type="dxa" w:w="1304"/>
-            <w:vAlign w:val="center"/>
-            <w:tcMar>
-              <w:top w:w="75" w:type="dxa"/>
-              <w:left w:w="95" w:type="dxa"/>
-              <w:bottom w:w="75" w:type="dxa"/>
-              <w:right w:w="95" w:type="dxa"/>
-            </w:tcMar>
-            <w:shd w:fill="FFFFFF"/>
-            <w:tcBorders>
-              <w:top w:val="single" w:sz="4" w:color="D9D9D9"/>
-              <w:left w:val="single" w:sz="4" w:color="D9D9D9"/>
-              <w:bottom w:val="single" w:sz="4" w:color="D9D9D9"/>
-              <w:right w:val="single" w:sz="4" w:color="D9D9D9"/>
-            </w:tcBorders>
-          </w:tcPr>
-          <w:p>
-            <w:pPr>
-              <w:spacing w:after="20" w:before="20" w:line="245" w:lineRule="auto"/>
-            </w:pPr>
-            <w:r>
-              <w:rPr>
-                <w:rFonts w:ascii="Arial" w:hAnsi="Arial"/>
-                <w:b w:val="0"/>
-                <w:color w:val="000000"/>
-                <w:sz w:val="19"/>
-              </w:rPr>
-              <w:t>30 a 50</w:t>
-            </w:r>
-          </w:p>
-        </w:tc>
-        <w:tc>
-          <w:tcPr>
-            <w:tcW w:type="dxa" w:w="8561"/>
-            <w:vAlign w:val="center"/>
-            <w:tcMar>
-              <w:top w:w="75" w:type="dxa"/>
-              <w:left w:w="95" w:type="dxa"/>
-              <w:bottom w:w="75" w:type="dxa"/>
-              <w:right w:w="95" w:type="dxa"/>
-            </w:tcMar>
-            <w:shd w:fill="FFFFFF"/>
-            <w:tcBorders>
-              <w:top w:val="single" w:sz="4" w:color="D9D9D9"/>
-              <w:left w:val="single" w:sz="4" w:color="D9D9D9"/>
-              <w:bottom w:val="single" w:sz="4" w:color="D9D9D9"/>
-              <w:right w:val="single" w:sz="4" w:color="D9D9D9"/>
-            </w:tcBorders>
-          </w:tcPr>
-          <w:p>
-            <w:pPr>
-              <w:spacing w:after="20" w:before="20" w:line="245" w:lineRule="auto"/>
-              <w:jc w:val="center"/>
-            </w:pPr>
-            <w:r>
-              <w:rPr>
-                <w:rFonts w:ascii="Arial" w:hAnsi="Arial"/>
-                <w:b w:val="0"/>
-                <w:color w:val="000000"/>
-                <w:sz w:val="19"/>
-              </w:rPr>
-              <w:t>Mostrar en la presentación la vista previa previamente preparada de HOLA o de y=x², identificada como vista previa. No pulsar ejecutar ni enviar G-code.</w:t>
-            </w:r>
-          </w:p>
-        </w:tc>
-      </w:tr>
-      <w:tr>
-        <w:trPr>
-          <w:cantSplit/>
-        </w:trPr>
-        <w:tc>
-          <w:tcPr>
-            <w:tcW w:type="dxa" w:w="1304"/>
-            <w:vAlign w:val="center"/>
-            <w:tcMar>
-              <w:top w:w="75" w:type="dxa"/>
-              <w:left w:w="95" w:type="dxa"/>
-              <w:bottom w:w="75" w:type="dxa"/>
-              <w:right w:w="95" w:type="dxa"/>
-            </w:tcMar>
-            <w:shd w:fill="F1F5F5"/>
-            <w:tcBorders>
-              <w:top w:val="single" w:sz="4" w:color="D9D9D9"/>
-              <w:left w:val="single" w:sz="4" w:color="D9D9D9"/>
-              <w:bottom w:val="single" w:sz="4" w:color="D9D9D9"/>
-              <w:right w:val="single" w:sz="4" w:color="D9D9D9"/>
-            </w:tcBorders>
-          </w:tcPr>
-          <w:p>
-            <w:pPr>
-              <w:spacing w:after="20" w:before="20" w:line="245" w:lineRule="auto"/>
-            </w:pPr>
-            <w:r>
-              <w:rPr>
-                <w:rFonts w:ascii="Arial" w:hAnsi="Arial"/>
-                <w:b w:val="0"/>
-                <w:color w:val="000000"/>
-                <w:sz w:val="19"/>
-              </w:rPr>
-              <w:t>50 a 65</w:t>
-            </w:r>
-          </w:p>
-        </w:tc>
-        <w:tc>
-          <w:tcPr>
-            <w:tcW w:type="dxa" w:w="8561"/>
-            <w:vAlign w:val="center"/>
-            <w:tcMar>
-              <w:top w:w="75" w:type="dxa"/>
-              <w:left w:w="95" w:type="dxa"/>
-              <w:bottom w:w="75" w:type="dxa"/>
-              <w:right w:w="95" w:type="dxa"/>
-            </w:tcMar>
-            <w:shd w:fill="F1F5F5"/>
-            <w:tcBorders>
-              <w:top w:val="single" w:sz="4" w:color="D9D9D9"/>
-              <w:left w:val="single" w:sz="4" w:color="D9D9D9"/>
-              <w:bottom w:val="single" w:sz="4" w:color="D9D9D9"/>
-              <w:right w:val="single" w:sz="4" w:color="D9D9D9"/>
-            </w:tcBorders>
-          </w:tcPr>
-          <w:p>
-            <w:pPr>
-              <w:spacing w:after="20" w:before="20" w:line="245" w:lineRule="auto"/>
-              <w:jc w:val="center"/>
-            </w:pPr>
-            <w:r>
-              <w:rPr>
-                <w:rFonts w:ascii="Arial" w:hAnsi="Arial"/>
-                <w:b w:val="0"/>
-                <w:color w:val="000000"/>
-                <w:sz w:val="19"/>
-              </w:rPr>
-              <w:t>Comparar solicitud, trayectoria y evidencia de ensayo en seco. Dejar visible que el contacto con papel no está confirmado.</w:t>
-            </w:r>
-          </w:p>
-        </w:tc>
-      </w:tr>
-    </w:tbl>
-    <w:p>
-      <w:pPr>
-        <w:spacing w:after="20"/>
-      </w:pPr>
-    </w:p>
-    <w:p>
-      <w:r>
-        <w:rPr>
-          <w:b w:val="0"/>
-        </w:rPr>
-        <w:t>Si falta referencia física, hay alarma o el operador no está listo, continuar con modelo y vista previa. No calibrar, desbloquear alarmas ni afirmar referencias desde estas diapositivas. Una eventual demostración física debe planearse y validarse por separado antes de la sustentación.</w:t>
+        <w:t>El maquetador conduce la demostración y el equipo apoya la pantalla y la consulta. Esta secuencia muestra cómo se prepara un trabajo sin enviar movimientos al mecanismo.</w:t>
       </w:r>
     </w:p>
     <w:p>
@@ -2326,7 +2208,7 @@
         <w:pStyle w:val="Heading2"/>
       </w:pPr>
       <w:r>
-        <w:t>Ejemplo reproducible de prompt</w:t>
+        <w:t>Paso 1</w:t>
       </w:r>
     </w:p>
     <w:p>
@@ -2334,7 +2216,7 @@
         <w:rPr>
           <w:b w:val="0"/>
         </w:rPr>
-        <w:t>Puede utilizarse en una sesión nueva de programación asistida. Debe acompañarse con los archivos y el esquema vigentes; no se presenta como captura histórica del desarrollo.</w:t>
+        <w:t>0 a 15 segundos. Mostrar el modelo 3D y señalar las dos direcciones del plano y el giro del portalápiz.</w:t>
       </w:r>
     </w:p>
     <w:p>
@@ -2342,7 +2224,7 @@
         <w:rPr>
           <w:b w:val="0"/>
         </w:rPr>
-        <w:t>Ayúdame a revisar un controlador CNC para Arduino Uno ATmega328P y tres motores 28BYJ-48 de 5 V con drivers ULN2003. El asistente Python corre en una Raspberry Pi 4B y se comunica por USB serial con firmware GRBL adaptado. Trabaja a partir de los archivos y esquema vigentes. Conserva límites, referencias físicas y parada. No inventes pines ni librerías; enumera las que realmente usa el código entregado y verifica compatibilidad. Separa preparación, validación y ejecución. No generes código que omita referencias ni desbloquee alarmas automáticamente. Propón un cambio pequeño, explica sus supuestos y entrega pruebas para límites, parada y entradas inválidas. Si falta información, indícala antes de modificar el control.</w:t>
+        <w:t>Decir: «Aquí vemos cómo se unen las piezas. Estos dos motores recorren la superficie y el tercero gira el soporte del lápiz.»</w:t>
       </w:r>
     </w:p>
     <w:p>
@@ -2350,7 +2232,7 @@
         <w:pStyle w:val="Heading2"/>
       </w:pPr>
       <w:r>
-        <w:t>Entrega al video</w:t>
+        <w:t>Paso 2</w:t>
       </w:r>
     </w:p>
     <w:p>
@@ -2358,7 +2240,95 @@
         <w:rPr>
           <w:b w:val="0"/>
         </w:rPr>
-        <w:t>Gestor de proyecto, al finalizar el bloque oral: «Ahora, el video». La reproducción empieza a los 12:00 y termina a los 15:00.</w:t>
+        <w:t>15 a 30 segundos. Mostrar una consulta de estado. Si no es una consulta en vivo, identificar la fecha del registro. No cambiar ajustes ni referencias.</w:t>
+      </w:r>
+    </w:p>
+    <w:p>
+      <w:r>
+        <w:rPr>
+          <w:b w:val="0"/>
+        </w:rPr>
+        <w:t>Decir: «Ahora consultamos cómo está el sistema. Esa información nos ayuda a saber si podemos continuar o si debemos revisar algo.»</w:t>
+      </w:r>
+    </w:p>
+    <w:p>
+      <w:r>
+        <w:rPr>
+          <w:b w:val="0"/>
+        </w:rPr>
+        <w:t>Si se muestra un registro guardado, decir: «Este es un registro del estado del sistema. Indicamos su fecha para que no se confunda con una consulta en vivo».</w:t>
+      </w:r>
+    </w:p>
+    <w:p>
+      <w:pPr>
+        <w:pStyle w:val="Heading2"/>
+      </w:pPr>
+      <w:r>
+        <w:t>Paso 3</w:t>
+      </w:r>
+    </w:p>
+    <w:p>
+      <w:r>
+        <w:rPr>
+          <w:b w:val="0"/>
+        </w:rPr>
+        <w:t>30 a 50 segundos. Mostrar la vista previa de HOLA ya preparada. No pulsar ejecutar ni enviar el archivo de movimiento.</w:t>
+      </w:r>
+    </w:p>
+    <w:p>
+      <w:r>
+        <w:rPr>
+          <w:b w:val="0"/>
+        </w:rPr>
+        <w:t>Decir: «Este es el recorrido preparado para la palabra HOLA. Podemos revisarlo antes de decidir si el mecanismo está listo para realizarlo.»</w:t>
+      </w:r>
+    </w:p>
+    <w:p>
+      <w:pPr>
+        <w:pStyle w:val="Heading2"/>
+      </w:pPr>
+      <w:r>
+        <w:t>Paso 4</w:t>
+      </w:r>
+    </w:p>
+    <w:p>
+      <w:r>
+        <w:rPr>
+          <w:b w:val="0"/>
+        </w:rPr>
+        <w:t>50 a 65 segundos. Cerrar la comparación entre la petición, el recorrido preparado y el ensayo en seco documentado.</w:t>
+      </w:r>
+    </w:p>
+    <w:p>
+      <w:r>
+        <w:rPr>
+          <w:b w:val="0"/>
+        </w:rPr>
+        <w:t>Decir: «El programa prepara el recorrido y tenemos un ensayo sin lápiz. La escritura en papel requiere comprobar el contacto y guardar esa prueba.»</w:t>
+      </w:r>
+    </w:p>
+    <w:p>
+      <w:r>
+        <w:rPr>
+          <w:b w:val="0"/>
+        </w:rPr>
+        <w:t>Si falta una referencia, aparece una alarma o el mecanismo no está preparado, mantener la demostración en consulta y vista previa. No calibrar, desbloquear ni enviar movimientos a partir de este documento. Una demostración física adicional requiere una revisión actual del montaje y un ensayo previo del operador.</w:t>
+      </w:r>
+    </w:p>
+    <w:p>
+      <w:pPr>
+        <w:pStyle w:val="Heading2"/>
+      </w:pPr>
+      <w:r>
+        <w:t>Diapositiva 16 Video de cierre</w:t>
+      </w:r>
+    </w:p>
+    <w:p>
+      <w:r>
+        <w:rPr>
+          <w:b w:val="0"/>
+        </w:rPr>
+        <w:t>El gestor dice de 11:58 a 12:00: «Ahora, el video». Reproducir la versión vigente de 180 segundos, con voz en español latino y música. El equipo no habla encima del video. Al terminar, comienza la ronda de preguntas de cinco minutos.</w:t>
       </w:r>
     </w:p>
     <w:p>
@@ -2371,7 +2341,292 @@
         <w:pStyle w:val="Heading1"/>
       </w:pPr>
       <w:r>
-        <w:t>Anexo de presupuesto</w:t>
+        <w:t>Palabras para practicar</w:t>
+      </w:r>
+    </w:p>
+    <w:p>
+      <w:r>
+        <w:rPr>
+          <w:b w:val="0"/>
+        </w:rPr>
+        <w:t>Estas definiciones ayudan al ensayo. Las palabras necesarias ya se explican dentro del discurso; no hace falta leer esta página frente al jurado.</w:t>
+      </w:r>
+    </w:p>
+    <w:p>
+      <w:r>
+        <w:rPr>
+          <w:b w:val="0"/>
+        </w:rPr>
+      </w:r>
+      <w:r>
+        <w:rPr>
+          <w:b/>
+        </w:rPr>
+        <w:t xml:space="preserve">Prototipo. </w:t>
+      </w:r>
+      <w:r>
+        <w:t>Primera versión que construimos para probar una idea y descubrir qué falta mejorar.</w:t>
+      </w:r>
+    </w:p>
+    <w:p>
+      <w:r>
+        <w:rPr>
+          <w:b w:val="0"/>
+        </w:rPr>
+      </w:r>
+      <w:r>
+        <w:rPr>
+          <w:b/>
+        </w:rPr>
+        <w:t xml:space="preserve">CNC. </w:t>
+      </w:r>
+      <w:r>
+        <w:t>Máquina que sigue movimientos indicados por un computador.</w:t>
+      </w:r>
+    </w:p>
+    <w:p>
+      <w:r>
+        <w:rPr>
+          <w:b w:val="0"/>
+        </w:rPr>
+      </w:r>
+      <w:r>
+        <w:rPr>
+          <w:b/>
+        </w:rPr>
+        <w:t xml:space="preserve">Hardware y software. </w:t>
+      </w:r>
+      <w:r>
+        <w:t>Hardware son las piezas físicas. Software son las instrucciones que las hacen trabajar.</w:t>
+      </w:r>
+    </w:p>
+    <w:p>
+      <w:r>
+        <w:rPr>
+          <w:b w:val="0"/>
+        </w:rPr>
+      </w:r>
+      <w:r>
+        <w:rPr>
+          <w:b/>
+        </w:rPr>
+        <w:t xml:space="preserve">Raspberry Pi y Arduino. </w:t>
+      </w:r>
+      <w:r>
+        <w:t>La Raspberry es un computador pequeño. El Arduino es una placa que controla el mecanismo.</w:t>
+      </w:r>
+    </w:p>
+    <w:p>
+      <w:r>
+        <w:rPr>
+          <w:b w:val="0"/>
+        </w:rPr>
+      </w:r>
+      <w:r>
+        <w:rPr>
+          <w:b/>
+        </w:rPr>
+        <w:t xml:space="preserve">API. </w:t>
+      </w:r>
+      <w:r>
+        <w:t>Conexión que permite a un programa pedir una función a otro servicio.</w:t>
+      </w:r>
+    </w:p>
+    <w:p>
+      <w:r>
+        <w:rPr>
+          <w:b w:val="0"/>
+        </w:rPr>
+      </w:r>
+      <w:r>
+        <w:rPr>
+          <w:b/>
+        </w:rPr>
+        <w:t xml:space="preserve">Prompt y Codex. </w:t>
+      </w:r>
+      <w:r>
+        <w:t>Prompt es la solicitud escrita a la inteligencia artificial. Codex es la herramienta que ayuda a trabajar con código.</w:t>
+      </w:r>
+    </w:p>
+    <w:p>
+      <w:r>
+        <w:rPr>
+          <w:b w:val="0"/>
+        </w:rPr>
+      </w:r>
+      <w:r>
+        <w:rPr>
+          <w:b/>
+        </w:rPr>
+        <w:t xml:space="preserve">Motor paso a paso y driver. </w:t>
+      </w:r>
+      <w:r>
+        <w:t>El motor gira en pequeños avances. El driver activa las partes eléctricas que producen ese giro.</w:t>
+      </w:r>
+    </w:p>
+    <w:p>
+      <w:r>
+        <w:rPr>
+          <w:b w:val="0"/>
+        </w:rPr>
+      </w:r>
+      <w:r>
+        <w:rPr>
+          <w:b/>
+        </w:rPr>
+        <w:t xml:space="preserve">X e Y. </w:t>
+      </w:r>
+      <w:r>
+        <w:t>Nombres de las dos direcciones de movimiento sobre una superficie, como una cuadrícula.</w:t>
+      </w:r>
+    </w:p>
+    <w:p>
+      <w:r>
+        <w:rPr>
+          <w:b w:val="0"/>
+        </w:rPr>
+      </w:r>
+      <w:r>
+        <w:rPr>
+          <w:b/>
+        </w:rPr>
+        <w:t xml:space="preserve">USB serial e I2C. </w:t>
+      </w:r>
+      <w:r>
+        <w:t>Son formas de comunicar las piezas. USB une Raspberry y Arduino; I2C comunica la pantalla.</w:t>
+      </w:r>
+    </w:p>
+    <w:p>
+      <w:r>
+        <w:rPr>
+          <w:b w:val="0"/>
+        </w:rPr>
+      </w:r>
+      <w:r>
+        <w:rPr>
+          <w:b/>
+        </w:rPr>
+        <w:t xml:space="preserve">Firmware y GRBL. </w:t>
+      </w:r>
+      <w:r>
+        <w:t>Firmware es el programa cargado en una placa. GRBL es la base del programa que controla los movimientos.</w:t>
+      </w:r>
+    </w:p>
+    <w:p>
+      <w:r>
+        <w:rPr>
+          <w:b w:val="0"/>
+        </w:rPr>
+      </w:r>
+      <w:r>
+        <w:rPr>
+          <w:b/>
+        </w:rPr>
+        <w:t xml:space="preserve">Código G. </w:t>
+      </w:r>
+      <w:r>
+        <w:t>Instrucciones de movimiento, por ejemplo para ir a una posición.</w:t>
+      </w:r>
+    </w:p>
+    <w:p>
+      <w:r>
+        <w:rPr>
+          <w:b w:val="0"/>
+        </w:rPr>
+      </w:r>
+      <w:r>
+        <w:rPr>
+          <w:b/>
+        </w:rPr>
+        <w:t xml:space="preserve">Variables y condiciones. </w:t>
+      </w:r>
+      <w:r>
+        <w:t>Las variables guardan datos. Las condiciones permiten elegir qué hacer según esos datos.</w:t>
+      </w:r>
+    </w:p>
+    <w:p>
+      <w:r>
+        <w:rPr>
+          <w:b w:val="0"/>
+        </w:rPr>
+      </w:r>
+      <w:r>
+        <w:rPr>
+          <w:b/>
+        </w:rPr>
+        <w:t xml:space="preserve">Calibrar y depurar. </w:t>
+      </w:r>
+      <w:r>
+        <w:t>Calibrar es comprobar la relación entre la orden y el movimiento. Depurar es revisar un problema y comprobar una corrección.</w:t>
+      </w:r>
+    </w:p>
+    <w:p>
+      <w:r>
+        <w:rPr>
+          <w:b w:val="0"/>
+        </w:rPr>
+      </w:r>
+      <w:r>
+        <w:rPr>
+          <w:b/>
+        </w:rPr>
+        <w:t xml:space="preserve">Vista previa y ensayo en seco. </w:t>
+      </w:r>
+      <w:r>
+        <w:t>La vista previa muestra el dibujo preparado. El ensayo en seco prueba movimientos sin escribir con el lápiz.</w:t>
+      </w:r>
+    </w:p>
+    <w:p>
+      <w:r>
+        <w:rPr>
+          <w:b w:val="0"/>
+        </w:rPr>
+      </w:r>
+      <w:r>
+        <w:rPr>
+          <w:b/>
+        </w:rPr>
+        <w:t xml:space="preserve">Impresión 3D y PLA. </w:t>
+      </w:r>
+      <w:r>
+        <w:t>La impresión 3D forma una pieza capa por capa. PLA es el plástico utilizado en las piezas impresas.</w:t>
+      </w:r>
+    </w:p>
+    <w:p>
+      <w:pPr>
+        <w:pStyle w:val="Heading2"/>
+      </w:pPr>
+      <w:r>
+        <w:t>Un ejemplo de solicitud a Codex</w:t>
+      </w:r>
+    </w:p>
+    <w:p>
+      <w:r>
+        <w:rPr>
+          <w:b w:val="0"/>
+        </w:rPr>
+        <w:t>Este prompt es un ejemplo preparado para explicar el método. No se presenta como una captura histórica del desarrollo.</w:t>
+      </w:r>
+    </w:p>
+    <w:p>
+      <w:r>
+        <w:rPr>
+          <w:b w:val="0"/>
+        </w:rPr>
+        <w:t>Tenemos un Arduino Uno R3, tres motores 28BYJ-48 con sus placas ULN2003 y una Raspberry Pi 4B. Queremos revisar el programa de un asistente que prepara dibujos. Explica qué hace cada parte con palabras sencillas. Trabaja con los archivos y conexiones actuales. No cambies los límites ni quites las alarmas. Propón un cambio pequeño y una forma de comprobarlo. Si te falta información, indícalo. Separa preparar el dibujo de ordenar un movimiento real.</w:t>
+      </w:r>
+    </w:p>
+    <w:p>
+      <w:r>
+        <w:br w:type="page"/>
+      </w:r>
+    </w:p>
+    <w:p>
+      <w:pPr>
+        <w:pStyle w:val="Heading1"/>
+      </w:pPr>
+      <w:r>
+        <w:t>Presupuesto para responder preguntas</w:t>
       </w:r>
     </w:p>
     <w:p>
@@ -2379,7 +2634,7 @@
         <w:rPr>
           <w:b/>
         </w:rPr>
-        <w:t>Referencia consultada el 15 de octubre de 2026   Valores en COP</w:t>
+        <w:t>Consulta del 15 de octubre de 2026   Valores en pesos colombianos</w:t>
       </w:r>
     </w:p>
     <w:p>
@@ -2387,7 +2642,7 @@
         <w:rPr>
           <w:b w:val="0"/>
         </w:rPr>
-        <w:t>Presupuesto de reposición con impresión propia y componentes complementarios. No equivale a gasto ejecutado. El inventario y las facturas determinan las compras adicionales frente a los materiales reutilizados.</w:t>
+        <w:t>Es una referencia de reposición: cuánto costaría reunir los materiales incluidos. El gasto real se comprueba con facturas y descontando lo que ya tiene el equipo. Se supone que la impresora 3D está disponible.</w:t>
       </w:r>
     </w:p>
     <w:tbl>
@@ -2436,7 +2691,7 @@
                 <w:rFonts w:ascii="Arial" w:hAnsi="Arial"/>
                 <w:b/>
                 <w:color w:val="FFFFFF"/>
-                <w:sz w:val="17"/>
+                <w:sz w:val="16"/>
               </w:rPr>
               <w:t>Concepto</w:t>
             </w:r>
@@ -2470,7 +2725,7 @@
                 <w:rFonts w:ascii="Arial" w:hAnsi="Arial"/>
                 <w:b/>
                 <w:color w:val="FFFFFF"/>
-                <w:sz w:val="17"/>
+                <w:sz w:val="16"/>
               </w:rPr>
               <w:t>#</w:t>
             </w:r>
@@ -2504,7 +2759,7 @@
                 <w:rFonts w:ascii="Arial" w:hAnsi="Arial"/>
                 <w:b/>
                 <w:color w:val="FFFFFF"/>
-                <w:sz w:val="17"/>
+                <w:sz w:val="16"/>
               </w:rPr>
               <w:t>Unitario</w:t>
             </w:r>
@@ -2538,7 +2793,7 @@
                 <w:rFonts w:ascii="Arial" w:hAnsi="Arial"/>
                 <w:b/>
                 <w:color w:val="FFFFFF"/>
-                <w:sz w:val="17"/>
+                <w:sz w:val="16"/>
               </w:rPr>
               <w:t>Subtotal</w:t>
             </w:r>
@@ -2572,7 +2827,7 @@
                 <w:rFonts w:ascii="Arial" w:hAnsi="Arial"/>
                 <w:b/>
                 <w:color w:val="FFFFFF"/>
-                <w:sz w:val="17"/>
+                <w:sz w:val="16"/>
               </w:rPr>
               <w:t>Base</w:t>
             </w:r>
@@ -2610,7 +2865,7 @@
                 <w:rFonts w:ascii="Arial" w:hAnsi="Arial"/>
                 <w:b w:val="0"/>
                 <w:color w:val="000000"/>
-                <w:sz w:val="17"/>
+                <w:sz w:val="16"/>
               </w:rPr>
               <w:t>Motor 28BYJ-48 5V + driver ULN2003</w:t>
             </w:r>
@@ -2644,7 +2899,7 @@
                 <w:rFonts w:ascii="Arial" w:hAnsi="Arial"/>
                 <w:b w:val="0"/>
                 <w:color w:val="000000"/>
-                <w:sz w:val="17"/>
+                <w:sz w:val="16"/>
               </w:rPr>
               <w:t>3</w:t>
             </w:r>
@@ -2678,7 +2933,7 @@
                 <w:rFonts w:ascii="Arial" w:hAnsi="Arial"/>
                 <w:b w:val="0"/>
                 <w:color w:val="000000"/>
-                <w:sz w:val="17"/>
+                <w:sz w:val="16"/>
               </w:rPr>
               <w:t>$17.000</w:t>
             </w:r>
@@ -2712,7 +2967,7 @@
                 <w:rFonts w:ascii="Arial" w:hAnsi="Arial"/>
                 <w:b w:val="0"/>
                 <w:color w:val="000000"/>
-                <w:sz w:val="17"/>
+                <w:sz w:val="16"/>
               </w:rPr>
               <w:t>$51.000</w:t>
             </w:r>
@@ -2746,9 +3001,9 @@
                 <w:rFonts w:ascii="Arial" w:hAnsi="Arial"/>
                 <w:b w:val="0"/>
                 <w:color w:val="000000"/>
-                <w:sz w:val="17"/>
+                <w:sz w:val="16"/>
               </w:rPr>
-              <w:t>P S1</w:t>
+              <w:t>Precio</w:t>
             </w:r>
           </w:p>
         </w:tc>
@@ -2784,7 +3039,7 @@
                 <w:rFonts w:ascii="Arial" w:hAnsi="Arial"/>
                 <w:b w:val="0"/>
                 <w:color w:val="000000"/>
-                <w:sz w:val="17"/>
+                <w:sz w:val="16"/>
               </w:rPr>
               <w:t>Arduino UNO R3 compatible CH340 + cable USB</w:t>
             </w:r>
@@ -2818,7 +3073,7 @@
                 <w:rFonts w:ascii="Arial" w:hAnsi="Arial"/>
                 <w:b w:val="0"/>
                 <w:color w:val="000000"/>
-                <w:sz w:val="17"/>
+                <w:sz w:val="16"/>
               </w:rPr>
               <w:t>1</w:t>
             </w:r>
@@ -2852,7 +3107,7 @@
                 <w:rFonts w:ascii="Arial" w:hAnsi="Arial"/>
                 <w:b w:val="0"/>
                 <w:color w:val="000000"/>
-                <w:sz w:val="17"/>
+                <w:sz w:val="16"/>
               </w:rPr>
               <w:t>$20.230</w:t>
             </w:r>
@@ -2886,7 +3141,7 @@
                 <w:rFonts w:ascii="Arial" w:hAnsi="Arial"/>
                 <w:b w:val="0"/>
                 <w:color w:val="000000"/>
-                <w:sz w:val="17"/>
+                <w:sz w:val="16"/>
               </w:rPr>
               <w:t>$20.230</w:t>
             </w:r>
@@ -2920,9 +3175,9 @@
                 <w:rFonts w:ascii="Arial" w:hAnsi="Arial"/>
                 <w:b w:val="0"/>
                 <w:color w:val="000000"/>
-                <w:sz w:val="17"/>
+                <w:sz w:val="16"/>
               </w:rPr>
-              <w:t>P S2</w:t>
+              <w:t>Precio</w:t>
             </w:r>
           </w:p>
         </w:tc>
@@ -2958,7 +3213,7 @@
                 <w:rFonts w:ascii="Arial" w:hAnsi="Arial"/>
                 <w:b w:val="0"/>
                 <w:color w:val="000000"/>
-                <w:sz w:val="17"/>
+                <w:sz w:val="16"/>
               </w:rPr>
               <w:t>Raspberry Pi 4B referencia 4GB</w:t>
             </w:r>
@@ -2992,7 +3247,7 @@
                 <w:rFonts w:ascii="Arial" w:hAnsi="Arial"/>
                 <w:b w:val="0"/>
                 <w:color w:val="000000"/>
-                <w:sz w:val="17"/>
+                <w:sz w:val="16"/>
               </w:rPr>
               <w:t>1</w:t>
             </w:r>
@@ -3026,7 +3281,7 @@
                 <w:rFonts w:ascii="Arial" w:hAnsi="Arial"/>
                 <w:b w:val="0"/>
                 <w:color w:val="000000"/>
-                <w:sz w:val="17"/>
+                <w:sz w:val="16"/>
               </w:rPr>
               <w:t>$549.900</w:t>
             </w:r>
@@ -3060,7 +3315,7 @@
                 <w:rFonts w:ascii="Arial" w:hAnsi="Arial"/>
                 <w:b w:val="0"/>
                 <w:color w:val="000000"/>
-                <w:sz w:val="17"/>
+                <w:sz w:val="16"/>
               </w:rPr>
               <w:t>$549.900</w:t>
             </w:r>
@@ -3094,9 +3349,9 @@
                 <w:rFonts w:ascii="Arial" w:hAnsi="Arial"/>
                 <w:b w:val="0"/>
                 <w:color w:val="000000"/>
-                <w:sz w:val="17"/>
+                <w:sz w:val="16"/>
               </w:rPr>
-              <w:t>P S3</w:t>
+              <w:t>Precio</w:t>
             </w:r>
           </w:p>
         </w:tc>
@@ -3132,7 +3387,7 @@
                 <w:rFonts w:ascii="Arial" w:hAnsi="Arial"/>
                 <w:b w:val="0"/>
                 <w:color w:val="000000"/>
-                <w:sz w:val="17"/>
+                <w:sz w:val="16"/>
               </w:rPr>
               <w:t>Dupont macho-hembra, tira x40 de 20cm</w:t>
             </w:r>
@@ -3166,7 +3421,7 @@
                 <w:rFonts w:ascii="Arial" w:hAnsi="Arial"/>
                 <w:b w:val="0"/>
                 <w:color w:val="000000"/>
-                <w:sz w:val="17"/>
+                <w:sz w:val="16"/>
               </w:rPr>
               <w:t>1</w:t>
             </w:r>
@@ -3200,7 +3455,7 @@
                 <w:rFonts w:ascii="Arial" w:hAnsi="Arial"/>
                 <w:b w:val="0"/>
                 <w:color w:val="000000"/>
-                <w:sz w:val="17"/>
+                <w:sz w:val="16"/>
               </w:rPr>
               <w:t>$6.545</w:t>
             </w:r>
@@ -3234,7 +3489,7 @@
                 <w:rFonts w:ascii="Arial" w:hAnsi="Arial"/>
                 <w:b w:val="0"/>
                 <w:color w:val="000000"/>
-                <w:sz w:val="17"/>
+                <w:sz w:val="16"/>
               </w:rPr>
               <w:t>$6.545</w:t>
             </w:r>
@@ -3268,9 +3523,9 @@
                 <w:rFonts w:ascii="Arial" w:hAnsi="Arial"/>
                 <w:b w:val="0"/>
                 <w:color w:val="000000"/>
-                <w:sz w:val="17"/>
+                <w:sz w:val="16"/>
               </w:rPr>
-              <w:t>P S4</w:t>
+              <w:t>Precio</w:t>
             </w:r>
           </w:p>
         </w:tc>
@@ -3306,7 +3561,7 @@
                 <w:rFonts w:ascii="Arial" w:hAnsi="Arial"/>
                 <w:b w:val="0"/>
                 <w:color w:val="000000"/>
-                <w:sz w:val="17"/>
+                <w:sz w:val="16"/>
               </w:rPr>
               <w:t>Dupont macho-macho, tira x40 de 20cm</w:t>
             </w:r>
@@ -3340,7 +3595,7 @@
                 <w:rFonts w:ascii="Arial" w:hAnsi="Arial"/>
                 <w:b w:val="0"/>
                 <w:color w:val="000000"/>
-                <w:sz w:val="17"/>
+                <w:sz w:val="16"/>
               </w:rPr>
               <w:t>1</w:t>
             </w:r>
@@ -3374,7 +3629,7 @@
                 <w:rFonts w:ascii="Arial" w:hAnsi="Arial"/>
                 <w:b w:val="0"/>
                 <w:color w:val="000000"/>
-                <w:sz w:val="17"/>
+                <w:sz w:val="16"/>
               </w:rPr>
               <w:t>$6.010</w:t>
             </w:r>
@@ -3408,7 +3663,7 @@
                 <w:rFonts w:ascii="Arial" w:hAnsi="Arial"/>
                 <w:b w:val="0"/>
                 <w:color w:val="000000"/>
-                <w:sz w:val="17"/>
+                <w:sz w:val="16"/>
               </w:rPr>
               <w:t>$6.010</w:t>
             </w:r>
@@ -3442,9 +3697,9 @@
                 <w:rFonts w:ascii="Arial" w:hAnsi="Arial"/>
                 <w:b w:val="0"/>
                 <w:color w:val="000000"/>
-                <w:sz w:val="17"/>
+                <w:sz w:val="16"/>
               </w:rPr>
-              <w:t>P S5</w:t>
+              <w:t>Precio</w:t>
             </w:r>
           </w:p>
         </w:tc>
@@ -3480,7 +3735,7 @@
                 <w:rFonts w:ascii="Arial" w:hAnsi="Arial"/>
                 <w:b w:val="0"/>
                 <w:color w:val="000000"/>
-                <w:sz w:val="17"/>
+                <w:sz w:val="16"/>
               </w:rPr>
               <w:t>PLA para impresión 3D: compra de rollo</w:t>
             </w:r>
@@ -3514,7 +3769,7 @@
                 <w:rFonts w:ascii="Arial" w:hAnsi="Arial"/>
                 <w:b w:val="0"/>
                 <w:color w:val="000000"/>
-                <w:sz w:val="17"/>
+                <w:sz w:val="16"/>
               </w:rPr>
               <w:t>1</w:t>
             </w:r>
@@ -3548,7 +3803,7 @@
                 <w:rFonts w:ascii="Arial" w:hAnsi="Arial"/>
                 <w:b w:val="0"/>
                 <w:color w:val="000000"/>
-                <w:sz w:val="17"/>
+                <w:sz w:val="16"/>
               </w:rPr>
               <w:t>$70.000</w:t>
             </w:r>
@@ -3582,7 +3837,7 @@
                 <w:rFonts w:ascii="Arial" w:hAnsi="Arial"/>
                 <w:b w:val="0"/>
                 <w:color w:val="000000"/>
-                <w:sz w:val="17"/>
+                <w:sz w:val="16"/>
               </w:rPr>
               <w:t>$70.000</w:t>
             </w:r>
@@ -3616,9 +3871,9 @@
                 <w:rFonts w:ascii="Arial" w:hAnsi="Arial"/>
                 <w:b w:val="0"/>
                 <w:color w:val="000000"/>
-                <w:sz w:val="17"/>
+                <w:sz w:val="16"/>
               </w:rPr>
-              <w:t>P S6,S7</w:t>
+              <w:t>Precio</w:t>
             </w:r>
           </w:p>
         </w:tc>
@@ -3654,7 +3909,7 @@
                 <w:rFonts w:ascii="Arial" w:hAnsi="Arial"/>
                 <w:b w:val="0"/>
                 <w:color w:val="000000"/>
-                <w:sz w:val="17"/>
+                <w:sz w:val="16"/>
               </w:rPr>
               <w:t>Impresión 3D: energía, desgaste y preparación</w:t>
             </w:r>
@@ -3688,7 +3943,7 @@
                 <w:rFonts w:ascii="Arial" w:hAnsi="Arial"/>
                 <w:b w:val="0"/>
                 <w:color w:val="000000"/>
-                <w:sz w:val="17"/>
+                <w:sz w:val="16"/>
               </w:rPr>
               <w:t>1</w:t>
             </w:r>
@@ -3722,7 +3977,7 @@
                 <w:rFonts w:ascii="Arial" w:hAnsi="Arial"/>
                 <w:b w:val="0"/>
                 <w:color w:val="000000"/>
-                <w:sz w:val="17"/>
+                <w:sz w:val="16"/>
               </w:rPr>
               <w:t>$20.000</w:t>
             </w:r>
@@ -3756,7 +4011,7 @@
                 <w:rFonts w:ascii="Arial" w:hAnsi="Arial"/>
                 <w:b w:val="0"/>
                 <w:color w:val="000000"/>
-                <w:sz w:val="17"/>
+                <w:sz w:val="16"/>
               </w:rPr>
               <w:t>$20.000</w:t>
             </w:r>
@@ -3790,9 +4045,9 @@
                 <w:rFonts w:ascii="Arial" w:hAnsi="Arial"/>
                 <w:b w:val="0"/>
                 <w:color w:val="000000"/>
-                <w:sz w:val="17"/>
+                <w:sz w:val="16"/>
               </w:rPr>
-              <w:t>E S7</w:t>
+              <w:t>Estimado</w:t>
             </w:r>
           </w:p>
         </w:tc>
@@ -3828,7 +4083,7 @@
                 <w:rFonts w:ascii="Arial" w:hAnsi="Arial"/>
                 <w:b w:val="0"/>
                 <w:color w:val="000000"/>
-                <w:sz w:val="17"/>
+                <w:sz w:val="16"/>
               </w:rPr>
               <w:t>Fuente USB-C 5V 3A para Pi4</w:t>
             </w:r>
@@ -3862,7 +4117,7 @@
                 <w:rFonts w:ascii="Arial" w:hAnsi="Arial"/>
                 <w:b w:val="0"/>
                 <w:color w:val="000000"/>
-                <w:sz w:val="17"/>
+                <w:sz w:val="16"/>
               </w:rPr>
               <w:t>1</w:t>
             </w:r>
@@ -3896,7 +4151,7 @@
                 <w:rFonts w:ascii="Arial" w:hAnsi="Arial"/>
                 <w:b w:val="0"/>
                 <w:color w:val="000000"/>
-                <w:sz w:val="17"/>
+                <w:sz w:val="16"/>
               </w:rPr>
               <w:t>$31.357</w:t>
             </w:r>
@@ -3930,7 +4185,7 @@
                 <w:rFonts w:ascii="Arial" w:hAnsi="Arial"/>
                 <w:b w:val="0"/>
                 <w:color w:val="000000"/>
-                <w:sz w:val="17"/>
+                <w:sz w:val="16"/>
               </w:rPr>
               <w:t>$31.357</w:t>
             </w:r>
@@ -3964,9 +4219,9 @@
                 <w:rFonts w:ascii="Arial" w:hAnsi="Arial"/>
                 <w:b w:val="0"/>
                 <w:color w:val="000000"/>
-                <w:sz w:val="17"/>
+                <w:sz w:val="16"/>
               </w:rPr>
-              <w:t>P S11</w:t>
+              <w:t>Precio</w:t>
             </w:r>
           </w:p>
         </w:tc>
@@ -4002,7 +4257,7 @@
                 <w:rFonts w:ascii="Arial" w:hAnsi="Arial"/>
                 <w:b w:val="0"/>
                 <w:color w:val="000000"/>
-                <w:sz w:val="17"/>
+                <w:sz w:val="16"/>
               </w:rPr>
               <w:t>Fuente externa 5V 2A para motores</w:t>
             </w:r>
@@ -4036,7 +4291,7 @@
                 <w:rFonts w:ascii="Arial" w:hAnsi="Arial"/>
                 <w:b w:val="0"/>
                 <w:color w:val="000000"/>
-                <w:sz w:val="17"/>
+                <w:sz w:val="16"/>
               </w:rPr>
               <w:t>1</w:t>
             </w:r>
@@ -4070,7 +4325,7 @@
                 <w:rFonts w:ascii="Arial" w:hAnsi="Arial"/>
                 <w:b w:val="0"/>
                 <w:color w:val="000000"/>
-                <w:sz w:val="17"/>
+                <w:sz w:val="16"/>
               </w:rPr>
               <w:t>$18.600</w:t>
             </w:r>
@@ -4104,7 +4359,7 @@
                 <w:rFonts w:ascii="Arial" w:hAnsi="Arial"/>
                 <w:b w:val="0"/>
                 <w:color w:val="000000"/>
-                <w:sz w:val="17"/>
+                <w:sz w:val="16"/>
               </w:rPr>
               <w:t>$18.600</w:t>
             </w:r>
@@ -4138,9 +4393,9 @@
                 <w:rFonts w:ascii="Arial" w:hAnsi="Arial"/>
                 <w:b w:val="0"/>
                 <w:color w:val="000000"/>
-                <w:sz w:val="17"/>
+                <w:sz w:val="16"/>
               </w:rPr>
-              <w:t>P S12</w:t>
+              <w:t>Precio</w:t>
             </w:r>
           </w:p>
         </w:tc>
@@ -4176,7 +4431,7 @@
                 <w:rFonts w:ascii="Arial" w:hAnsi="Arial"/>
                 <w:b w:val="0"/>
                 <w:color w:val="000000"/>
-                <w:sz w:val="17"/>
+                <w:sz w:val="16"/>
               </w:rPr>
               <w:t>Protoboard MB102 830 puntos</w:t>
             </w:r>
@@ -4210,7 +4465,7 @@
                 <w:rFonts w:ascii="Arial" w:hAnsi="Arial"/>
                 <w:b w:val="0"/>
                 <w:color w:val="000000"/>
-                <w:sz w:val="17"/>
+                <w:sz w:val="16"/>
               </w:rPr>
               <w:t>1</w:t>
             </w:r>
@@ -4244,7 +4499,7 @@
                 <w:rFonts w:ascii="Arial" w:hAnsi="Arial"/>
                 <w:b w:val="0"/>
                 <w:color w:val="000000"/>
-                <w:sz w:val="17"/>
+                <w:sz w:val="16"/>
               </w:rPr>
               <w:t>$14.221</w:t>
             </w:r>
@@ -4278,7 +4533,7 @@
                 <w:rFonts w:ascii="Arial" w:hAnsi="Arial"/>
                 <w:b w:val="0"/>
                 <w:color w:val="000000"/>
-                <w:sz w:val="17"/>
+                <w:sz w:val="16"/>
               </w:rPr>
               <w:t>$14.221</w:t>
             </w:r>
@@ -4312,9 +4567,9 @@
                 <w:rFonts w:ascii="Arial" w:hAnsi="Arial"/>
                 <w:b w:val="0"/>
                 <w:color w:val="000000"/>
-                <w:sz w:val="17"/>
+                <w:sz w:val="16"/>
               </w:rPr>
-              <w:t>P S13</w:t>
+              <w:t>Precio</w:t>
             </w:r>
           </w:p>
         </w:tc>
@@ -4350,7 +4605,7 @@
                 <w:rFonts w:ascii="Arial" w:hAnsi="Arial"/>
                 <w:b w:val="0"/>
                 <w:color w:val="000000"/>
-                <w:sz w:val="17"/>
+                <w:sz w:val="16"/>
               </w:rPr>
               <w:t>MicroSD 32GB Clase 10 para el sistema</w:t>
             </w:r>
@@ -4384,7 +4639,7 @@
                 <w:rFonts w:ascii="Arial" w:hAnsi="Arial"/>
                 <w:b w:val="0"/>
                 <w:color w:val="000000"/>
-                <w:sz w:val="17"/>
+                <w:sz w:val="16"/>
               </w:rPr>
               <w:t>1</w:t>
             </w:r>
@@ -4418,7 +4673,7 @@
                 <w:rFonts w:ascii="Arial" w:hAnsi="Arial"/>
                 <w:b w:val="0"/>
                 <w:color w:val="000000"/>
-                <w:sz w:val="17"/>
+                <w:sz w:val="16"/>
               </w:rPr>
               <w:t>$69.500</w:t>
             </w:r>
@@ -4452,7 +4707,7 @@
                 <w:rFonts w:ascii="Arial" w:hAnsi="Arial"/>
                 <w:b w:val="0"/>
                 <w:color w:val="000000"/>
-                <w:sz w:val="17"/>
+                <w:sz w:val="16"/>
               </w:rPr>
               <w:t>$69.500</w:t>
             </w:r>
@@ -4486,9 +4741,9 @@
                 <w:rFonts w:ascii="Arial" w:hAnsi="Arial"/>
                 <w:b w:val="0"/>
                 <w:color w:val="000000"/>
-                <w:sz w:val="17"/>
+                <w:sz w:val="16"/>
               </w:rPr>
-              <w:t>P S14</w:t>
+              <w:t>Precio</w:t>
             </w:r>
           </w:p>
         </w:tc>
@@ -4524,7 +4779,7 @@
                 <w:rFonts w:ascii="Arial" w:hAnsi="Arial"/>
                 <w:b w:val="0"/>
                 <w:color w:val="000000"/>
-                <w:sz w:val="17"/>
+                <w:sz w:val="16"/>
               </w:rPr>
               <w:t>Tornillería, ejes/rodamientos y fijaciones</w:t>
             </w:r>
@@ -4558,7 +4813,7 @@
                 <w:rFonts w:ascii="Arial" w:hAnsi="Arial"/>
                 <w:b w:val="0"/>
                 <w:color w:val="000000"/>
-                <w:sz w:val="17"/>
+                <w:sz w:val="16"/>
               </w:rPr>
               <w:t>1</w:t>
             </w:r>
@@ -4592,7 +4847,7 @@
                 <w:rFonts w:ascii="Arial" w:hAnsi="Arial"/>
                 <w:b w:val="0"/>
                 <w:color w:val="000000"/>
-                <w:sz w:val="17"/>
+                <w:sz w:val="16"/>
               </w:rPr>
               <w:t>$30.000</w:t>
             </w:r>
@@ -4626,7 +4881,7 @@
                 <w:rFonts w:ascii="Arial" w:hAnsi="Arial"/>
                 <w:b w:val="0"/>
                 <w:color w:val="000000"/>
-                <w:sz w:val="17"/>
+                <w:sz w:val="16"/>
               </w:rPr>
               <w:t>$30.000</w:t>
             </w:r>
@@ -4660,9 +4915,9 @@
                 <w:rFonts w:ascii="Arial" w:hAnsi="Arial"/>
                 <w:b w:val="0"/>
                 <w:color w:val="000000"/>
-                <w:sz w:val="17"/>
+                <w:sz w:val="16"/>
               </w:rPr>
-              <w:t>E S16</w:t>
+              <w:t>Estimado</w:t>
             </w:r>
           </w:p>
         </w:tc>
@@ -4698,7 +4953,7 @@
                 <w:rFonts w:ascii="Arial" w:hAnsi="Arial"/>
                 <w:b w:val="0"/>
                 <w:color w:val="000000"/>
-                <w:sz w:val="17"/>
+                <w:sz w:val="16"/>
               </w:rPr>
               <w:t>Bolígrafo, papel y consumibles de pruebas</w:t>
             </w:r>
@@ -4732,7 +4987,7 @@
                 <w:rFonts w:ascii="Arial" w:hAnsi="Arial"/>
                 <w:b w:val="0"/>
                 <w:color w:val="000000"/>
-                <w:sz w:val="17"/>
+                <w:sz w:val="16"/>
               </w:rPr>
               <w:t>1</w:t>
             </w:r>
@@ -4766,7 +5021,7 @@
                 <w:rFonts w:ascii="Arial" w:hAnsi="Arial"/>
                 <w:b w:val="0"/>
                 <w:color w:val="000000"/>
-                <w:sz w:val="17"/>
+                <w:sz w:val="16"/>
               </w:rPr>
               <w:t>$10.000</w:t>
             </w:r>
@@ -4800,7 +5055,7 @@
                 <w:rFonts w:ascii="Arial" w:hAnsi="Arial"/>
                 <w:b w:val="0"/>
                 <w:color w:val="000000"/>
-                <w:sz w:val="17"/>
+                <w:sz w:val="16"/>
               </w:rPr>
               <w:t>$10.000</w:t>
             </w:r>
@@ -4834,9 +5089,9 @@
                 <w:rFonts w:ascii="Arial" w:hAnsi="Arial"/>
                 <w:b w:val="0"/>
                 <w:color w:val="000000"/>
-                <w:sz w:val="17"/>
+                <w:sz w:val="16"/>
               </w:rPr>
-              <w:t xml:space="preserve">E </w:t>
+              <w:t>Estimado</w:t>
             </w:r>
           </w:p>
         </w:tc>
@@ -4872,7 +5127,7 @@
                 <w:rFonts w:ascii="Arial" w:hAnsi="Arial"/>
                 <w:b w:val="0"/>
                 <w:color w:val="000000"/>
-                <w:sz w:val="17"/>
+                <w:sz w:val="16"/>
               </w:rPr>
               <w:t>Envíos y adaptadores menores</w:t>
             </w:r>
@@ -4906,7 +5161,7 @@
                 <w:rFonts w:ascii="Arial" w:hAnsi="Arial"/>
                 <w:b w:val="0"/>
                 <w:color w:val="000000"/>
-                <w:sz w:val="17"/>
+                <w:sz w:val="16"/>
               </w:rPr>
               <w:t>1</w:t>
             </w:r>
@@ -4940,7 +5195,7 @@
                 <w:rFonts w:ascii="Arial" w:hAnsi="Arial"/>
                 <w:b w:val="0"/>
                 <w:color w:val="000000"/>
-                <w:sz w:val="17"/>
+                <w:sz w:val="16"/>
               </w:rPr>
               <w:t>$30.000</w:t>
             </w:r>
@@ -4974,7 +5229,7 @@
                 <w:rFonts w:ascii="Arial" w:hAnsi="Arial"/>
                 <w:b w:val="0"/>
                 <w:color w:val="000000"/>
-                <w:sz w:val="17"/>
+                <w:sz w:val="16"/>
               </w:rPr>
               <w:t>$30.000</w:t>
             </w:r>
@@ -5008,9 +5263,9 @@
                 <w:rFonts w:ascii="Arial" w:hAnsi="Arial"/>
                 <w:b w:val="0"/>
                 <w:color w:val="000000"/>
-                <w:sz w:val="17"/>
+                <w:sz w:val="16"/>
               </w:rPr>
-              <w:t>E S6</w:t>
+              <w:t>Estimado</w:t>
             </w:r>
           </w:p>
         </w:tc>
@@ -5046,7 +5301,7 @@
                 <w:rFonts w:ascii="Arial" w:hAnsi="Arial"/>
                 <w:b w:val="0"/>
                 <w:color w:val="000000"/>
-                <w:sz w:val="17"/>
+                <w:sz w:val="16"/>
               </w:rPr>
               <w:t>Recarga API OpenAI USD10</w:t>
             </w:r>
@@ -5080,7 +5335,7 @@
                 <w:rFonts w:ascii="Arial" w:hAnsi="Arial"/>
                 <w:b w:val="0"/>
                 <w:color w:val="000000"/>
-                <w:sz w:val="17"/>
+                <w:sz w:val="16"/>
               </w:rPr>
               <w:t>1</w:t>
             </w:r>
@@ -5114,7 +5369,7 @@
                 <w:rFonts w:ascii="Arial" w:hAnsi="Arial"/>
                 <w:b w:val="0"/>
                 <w:color w:val="000000"/>
-                <w:sz w:val="17"/>
+                <w:sz w:val="16"/>
               </w:rPr>
               <w:t>$31.976,50</w:t>
             </w:r>
@@ -5148,7 +5403,7 @@
                 <w:rFonts w:ascii="Arial" w:hAnsi="Arial"/>
                 <w:b w:val="0"/>
                 <w:color w:val="000000"/>
-                <w:sz w:val="17"/>
+                <w:sz w:val="16"/>
               </w:rPr>
               <w:t>$31.976,50</w:t>
             </w:r>
@@ -5182,9 +5437,9 @@
                 <w:rFonts w:ascii="Arial" w:hAnsi="Arial"/>
                 <w:b w:val="0"/>
                 <w:color w:val="000000"/>
-                <w:sz w:val="17"/>
+                <w:sz w:val="16"/>
               </w:rPr>
-              <w:t>USD S8,S9</w:t>
+              <w:t>USD</w:t>
             </w:r>
           </w:p>
         </w:tc>
@@ -5220,7 +5475,7 @@
                 <w:rFonts w:ascii="Arial" w:hAnsi="Arial"/>
                 <w:b w:val="0"/>
                 <w:color w:val="000000"/>
-                <w:sz w:val="17"/>
+                <w:sz w:val="16"/>
               </w:rPr>
               <w:t>Recarga ElevenLabs PAYG USD10</w:t>
             </w:r>
@@ -5254,7 +5509,7 @@
                 <w:rFonts w:ascii="Arial" w:hAnsi="Arial"/>
                 <w:b w:val="0"/>
                 <w:color w:val="000000"/>
-                <w:sz w:val="17"/>
+                <w:sz w:val="16"/>
               </w:rPr>
               <w:t>1</w:t>
             </w:r>
@@ -5288,7 +5543,7 @@
                 <w:rFonts w:ascii="Arial" w:hAnsi="Arial"/>
                 <w:b w:val="0"/>
                 <w:color w:val="000000"/>
-                <w:sz w:val="17"/>
+                <w:sz w:val="16"/>
               </w:rPr>
               <w:t>$31.976,50</w:t>
             </w:r>
@@ -5322,7 +5577,7 @@
                 <w:rFonts w:ascii="Arial" w:hAnsi="Arial"/>
                 <w:b w:val="0"/>
                 <w:color w:val="000000"/>
-                <w:sz w:val="17"/>
+                <w:sz w:val="16"/>
               </w:rPr>
               <w:t>$31.976,50</w:t>
             </w:r>
@@ -5356,9 +5611,9 @@
                 <w:rFonts w:ascii="Arial" w:hAnsi="Arial"/>
                 <w:b w:val="0"/>
                 <w:color w:val="000000"/>
-                <w:sz w:val="17"/>
+                <w:sz w:val="16"/>
               </w:rPr>
-              <w:t>USD S8,S10</w:t>
+              <w:t>USD</w:t>
             </w:r>
           </w:p>
         </w:tc>
@@ -5374,7 +5629,7 @@
         <w:rPr>
           <w:b/>
         </w:rPr>
-        <w:t>Subtotal $991.316   Reserva 10% $99.132   Total $1.090.448</w:t>
+        <w:t>Subtotal $991.316   Reserva del 10% $99.132   Total $1.090.448</w:t>
       </w:r>
     </w:p>
     <w:p>
@@ -5382,7 +5637,7 @@
         <w:rPr>
           <w:b w:val="0"/>
         </w:rPr>
-        <w:t>P: precio público. E: estimación de planeación. USD: conversión presupuestal. S1 a S16 remiten a las fuentes del anexo. TRM oficial: COP3.197,65/USD. USD10 por proveedor = COP31.976,50; dos recargas = COP63.953 antes de impuestos y comisión bancaria.</w:t>
+        <w:t>Los tres motores con sus placas de control suman $51.000. Se reservan USD10 para OpenAI y USD10 para ElevenLabs: juntos equivalen a $63.953 con la tasa de cambio consultada. No garantizan un mes de uso ni son pagos realizados. Impuestos y comisión bancaria pueden modificar el cargo.</w:t>
       </w:r>
     </w:p>
     <w:p>
@@ -5390,7 +5645,7 @@
         <w:rPr>
           <w:b w:val="0"/>
         </w:rPr>
-        <w:t>Se presupuesta comprar un rollo PLA completo; los gramos consumidos salen del laminador. La reserva de impresión incluye energía, desgaste y preparación, y supone impresora disponible. Los lotes de fijaciones, consumibles y envíos son estimaciones. Pantalla, audio, cabeza, eventual segundo Arduino, computador, internet y horas de desarrollo quedan fuera de este subtotal.</w:t>
+        <w:t>Precio significa valor público consultado; estimado es una reserva de planeación. Se incluye un rollo de plástico PLA y una reserva de operación de la impresión. La pantalla, el audio y otros elementos reutilizados no están valorados en este subtotal. El enfriador no tiene una cotización separada en esta referencia. Antes de comprar, revisar inventario y disponibilidad.</w:t>
       </w:r>
     </w:p>
     <w:p>
@@ -5403,7 +5658,71 @@
         <w:pStyle w:val="Heading1"/>
       </w:pPr>
       <w:r>
-        <w:t>Ensayo y evidencias del proceso</w:t>
+        <w:t>Ensayo y relación con la guía SENA</w:t>
+      </w:r>
+    </w:p>
+    <w:p>
+      <w:r>
+        <w:rPr>
+          <w:b w:val="0"/>
+        </w:rPr>
+        <w:t>El discurso está organizado por diapositiva. Los seis roles conservan dos minutos cada uno. El maquetador reserva 65 segundos para la demostración dentro de su bloque.</w:t>
+      </w:r>
+    </w:p>
+    <w:p>
+      <w:r>
+        <w:rPr>
+          <w:b w:val="0"/>
+        </w:rPr>
+        <w:t>Ensayar con cronómetro. Los textos se dicen con pausas y señalando la pieza o imagen correspondiente. No leer los anexos ni las preguntas del jurado durante los doce minutos.</w:t>
+      </w:r>
+    </w:p>
+    <w:p>
+      <w:r>
+        <w:rPr>
+          <w:b w:val="0"/>
+        </w:rPr>
+        <w:t>La guía exige una demostración funcional en vivo. La secuencia preparada permite consultar y mostrar el trabajo. El ensayo en seco no demuestra escritura sobre papel; incorporar una prueba física solo después de validarla y conservar su evidencia.</w:t>
+      </w:r>
+    </w:p>
+    <w:p>
+      <w:r>
+        <w:rPr>
+          <w:b w:val="0"/>
+        </w:rPr>
+        <w:t>La guía propone Gemini para programar y pide explicar un error de compilación. El proyecto se explica desde la ayuda de Codex y la alarma de medición documentada. No inventar uso de Gemini, capturas históricas ni un mensaje de compilación.</w:t>
+      </w:r>
+    </w:p>
+    <w:p>
+      <w:r>
+        <w:rPr>
+          <w:b w:val="0"/>
+        </w:rPr>
+        <w:t>El video vigente dura 180 segundos y tiene voz en español latino y música. El equipo no habla encima de él. El gestor lo presenta al terminar el bloque oral.</w:t>
+      </w:r>
+    </w:p>
+    <w:p>
+      <w:r>
+        <w:rPr>
+          <w:b w:val="0"/>
+        </w:rPr>
+        <w:t>Durante la proyección, evitar que el audio active órdenes del asistente. El operador prepara el prototipo antes de empezar la presentación.</w:t>
+      </w:r>
+    </w:p>
+    <w:p>
+      <w:r>
+        <w:rPr>
+          <w:b w:val="0"/>
+        </w:rPr>
+        <w:t>El presupuesto conserva la consulta del 15 de octubre de 2026. Es una referencia de reposición, con estimaciones indicadas, y no una lista de gastos ya pagados.</w:t>
+      </w:r>
+    </w:p>
+    <w:p>
+      <w:r>
+        <w:rPr>
+          <w:b w:val="0"/>
+        </w:rPr>
+        <w:t>Los nombres quedan como roles genéricos, según lo autorizado. No mostrar claves, contraseñas ni datos privados en las capturas.</w:t>
       </w:r>
     </w:p>
     <w:p>
@@ -5411,7 +5730,7 @@
         <w:pStyle w:val="Heading2"/>
       </w:pPr>
       <w:r>
-        <w:t>Antes de la sustentación</w:t>
+        <w:t>Lo que pide la guía y cómo se explica</w:t>
       </w:r>
     </w:p>
     <w:p>
@@ -5419,7 +5738,15 @@
         <w:rPr>
           <w:b w:val="0"/>
         </w:rPr>
-        <w:t>Los textos son una base para ensayo oral; ajustar velocidad natural y transiciones al cronómetro sin acelerar los términos técnicos. Los cinco primeros roles apuntan a aproximadamente 210 a 235 palabras; el maquetador reserva unos 65 segundos de demostración.</w:t>
+      </w:r>
+      <w:r>
+        <w:rPr>
+          <w:b/>
+        </w:rPr>
+        <w:t xml:space="preserve">15 minutos de presentación y 5 de preguntas. </w:t>
+      </w:r>
+      <w:r>
+        <w:t>Se reservan 12 minutos de exposición y demostración, 3 de video y 5 adicionales para el jurado.</w:t>
       </w:r>
     </w:p>
     <w:p>
@@ -5427,7 +5754,15 @@
         <w:rPr>
           <w:b w:val="0"/>
         </w:rPr>
-        <w:t>La guía exige demostración funcional en vivo. La secuencia incluida demuestra consulta y preparación; no equivale a escritura física. Añadir el ensayo con papel solo después de verificar contacto, referencia y condiciones actuales.</w:t>
+      </w:r>
+      <w:r>
+        <w:rPr>
+          <w:b/>
+        </w:rPr>
+        <w:t xml:space="preserve">Cada integrante defiende su área. </w:t>
+      </w:r>
+      <w:r>
+        <w:t>Seis roles genéricos, cada uno con dos minutos y preguntas para ensayar.</w:t>
       </w:r>
     </w:p>
     <w:p>
@@ -5435,7 +5770,15 @@
         <w:rPr>
           <w:b w:val="0"/>
         </w:rPr>
-        <w:t>La guía menciona prompts iniciales con Gemini y error de compilación. No hay capturas históricas ni mensaje real de compilación acreditados. El prompt es un ejemplo reproducible y ALARM9 es una falla real de medición. No presentar esas evidencias como intercambiables.</w:t>
+      </w:r>
+      <w:r>
+        <w:rPr>
+          <w:b/>
+        </w:rPr>
+        <w:t xml:space="preserve">Programación asistida y revisión de errores. </w:t>
+      </w:r>
+      <w:r>
+        <w:t>Se explica la ayuda real de Codex y un prompt de ejemplo, sin presentarlo como captura histórica.</w:t>
       </w:r>
     </w:p>
     <w:p>
@@ -5443,7 +5786,15 @@
         <w:rPr>
           <w:b w:val="0"/>
         </w:rPr>
-        <w:t>La creación del archivo no transmite instrucciones al robot. El operador debe evitar audio de comandos que pueda activarlo durante el video. Preparar la reproducción con el CNC en espera segura.</w:t>
+      </w:r>
+      <w:r>
+        <w:rPr>
+          <w:b/>
+        </w:rPr>
+        <w:t xml:space="preserve">Error de compilación o sintaxis. </w:t>
+      </w:r>
+      <w:r>
+        <w:t>El caso acreditado es ALARM9 durante una medición. Se explica la diferencia; no se inventa un error de compilación.</w:t>
       </w:r>
     </w:p>
     <w:p>
@@ -5451,15 +5802,52 @@
         <w:rPr>
           <w:b w:val="0"/>
         </w:rPr>
-        <w:t>La consulta del presupuesto es del 15/10/2026. Las recargas no son pagos realizados. Revisar inventario, disponibilidad, impuestos y comisión bancaria antes de comprar.</w:t>
+      </w:r>
+      <w:r>
+        <w:rPr>
+          <w:b/>
+        </w:rPr>
+        <w:t xml:space="preserve">Demostración funcional en vivo. </w:t>
+      </w:r>
+      <w:r>
+        <w:t>Se organiza consulta y preparación. La escritura física sobre papel sigue por demostrar.</w:t>
+      </w:r>
+    </w:p>
+    <w:p>
+      <w:r>
+        <w:rPr>
+          <w:b w:val="0"/>
+        </w:rPr>
+      </w:r>
+      <w:r>
+        <w:rPr>
+          <w:b/>
+        </w:rPr>
+        <w:t xml:space="preserve">Video de proceso de tres minutos. </w:t>
+      </w:r>
+      <w:r>
+        <w:t>Se usa el video vigente de 180 segundos con narración en español latino. Las imágenes respaldan el proceso documentado.</w:t>
+      </w:r>
+    </w:p>
+    <w:p>
+      <w:r>
+        <w:br w:type="page"/>
       </w:r>
     </w:p>
     <w:p>
       <w:pPr>
-        <w:pStyle w:val="Heading2"/>
+        <w:pStyle w:val="Heading1"/>
       </w:pPr>
       <w:r>
-        <w:t>Videoclip de tres minutos</w:t>
+        <w:t>Video de cierre y evidencia</w:t>
+      </w:r>
+    </w:p>
+    <w:p>
+      <w:r>
+        <w:rPr>
+          <w:b w:val="0"/>
+        </w:rPr>
+        <w:t>La diapositiva 16 reproduce el video vigente con narración. Su tiempo se cuenta desde que inicia la reproducción, después de los doce minutos de intervención del equipo.</w:t>
       </w:r>
     </w:p>
     <w:tbl>
@@ -5470,9 +5858,9 @@
         <w:tblLook w:firstColumn="1" w:firstRow="1" w:lastColumn="0" w:lastRow="0" w:noHBand="0" w:noVBand="1" w:val="04A0"/>
       </w:tblPr>
       <w:tblGrid>
-        <w:gridCol w:w="1587"/>
-        <w:gridCol w:w="1814"/>
-        <w:gridCol w:w="6463"/>
+        <w:gridCol w:w="1701"/>
+        <w:gridCol w:w="2438"/>
+        <w:gridCol w:w="5726"/>
       </w:tblGrid>
       <w:tr>
         <w:trPr>
@@ -5481,7 +5869,7 @@
         </w:trPr>
         <w:tc>
           <w:tcPr>
-            <w:tcW w:type="dxa" w:w="1587"/>
+            <w:tcW w:type="dxa" w:w="1701"/>
             <w:vAlign w:val="center"/>
             <w:tcMar>
               <w:top w:w="75" w:type="dxa"/>
@@ -5506,15 +5894,15 @@
                 <w:rFonts w:ascii="Arial" w:hAnsi="Arial"/>
                 <w:b/>
                 <w:color w:val="FFFFFF"/>
-                <w:sz w:val="18"/>
+                <w:sz w:val="19"/>
               </w:rPr>
-              <w:t>Tiempo</w:t>
+              <w:t>Tiempo del video</w:t>
             </w:r>
           </w:p>
         </w:tc>
         <w:tc>
           <w:tcPr>
-            <w:tcW w:type="dxa" w:w="1814"/>
+            <w:tcW w:type="dxa" w:w="2438"/>
             <w:vAlign w:val="center"/>
             <w:tcMar>
               <w:top w:w="75" w:type="dxa"/>
@@ -5540,15 +5928,15 @@
                 <w:rFonts w:ascii="Arial" w:hAnsi="Arial"/>
                 <w:b/>
                 <w:color w:val="FFFFFF"/>
-                <w:sz w:val="18"/>
+                <w:sz w:val="19"/>
               </w:rPr>
-              <w:t>Bloque</w:t>
+              <w:t>Parte</w:t>
             </w:r>
           </w:p>
         </w:tc>
         <w:tc>
           <w:tcPr>
-            <w:tcW w:type="dxa" w:w="6463"/>
+            <w:tcW w:type="dxa" w:w="5726"/>
             <w:vAlign w:val="center"/>
             <w:tcMar>
               <w:top w:w="75" w:type="dxa"/>
@@ -5574,9 +5962,9 @@
                 <w:rFonts w:ascii="Arial" w:hAnsi="Arial"/>
                 <w:b/>
                 <w:color w:val="FFFFFF"/>
-                <w:sz w:val="18"/>
+                <w:sz w:val="19"/>
               </w:rPr>
-              <w:t>Contenido</w:t>
+              <w:t>Qué explica</w:t>
             </w:r>
           </w:p>
         </w:tc>
@@ -5587,7 +5975,7 @@
         </w:trPr>
         <w:tc>
           <w:tcPr>
-            <w:tcW w:type="dxa" w:w="1587"/>
+            <w:tcW w:type="dxa" w:w="1701"/>
             <w:vAlign w:val="center"/>
             <w:tcMar>
               <w:top w:w="75" w:type="dxa"/>
@@ -5612,7 +6000,7 @@
                 <w:rFonts w:ascii="Arial" w:hAnsi="Arial"/>
                 <w:b w:val="0"/>
                 <w:color w:val="000000"/>
-                <w:sz w:val="18"/>
+                <w:sz w:val="19"/>
               </w:rPr>
               <w:t>00:00–00:30</w:t>
             </w:r>
@@ -5620,7 +6008,7 @@
         </w:tc>
         <w:tc>
           <w:tcPr>
-            <w:tcW w:type="dxa" w:w="1814"/>
+            <w:tcW w:type="dxa" w:w="2438"/>
             <w:vAlign w:val="center"/>
             <w:tcMar>
               <w:top w:w="75" w:type="dxa"/>
@@ -5646,7 +6034,7 @@
                 <w:rFonts w:ascii="Arial" w:hAnsi="Arial"/>
                 <w:b w:val="0"/>
                 <w:color w:val="000000"/>
-                <w:sz w:val="18"/>
+                <w:sz w:val="19"/>
               </w:rPr>
               <w:t>El reto</w:t>
             </w:r>
@@ -5654,7 +6042,7 @@
         </w:tc>
         <w:tc>
           <w:tcPr>
-            <w:tcW w:type="dxa" w:w="6463"/>
+            <w:tcW w:type="dxa" w:w="5726"/>
             <w:vAlign w:val="center"/>
             <w:tcMar>
               <w:top w:w="75" w:type="dxa"/>
@@ -5680,9 +6068,9 @@
                 <w:rFonts w:ascii="Arial" w:hAnsi="Arial"/>
                 <w:b w:val="0"/>
                 <w:color w:val="000000"/>
-                <w:sz w:val="18"/>
+                <w:sz w:val="19"/>
               </w:rPr>
-              <w:t>Necesidad educativa y objetivo. Mostrar el ejemplo de prompt identificado como sesión reproducible si no existen capturas históricas.</w:t>
+              <w:t>Presentación de la idea y del propósito educativo.</w:t>
             </w:r>
           </w:p>
         </w:tc>
@@ -5693,7 +6081,7 @@
         </w:trPr>
         <w:tc>
           <w:tcPr>
-            <w:tcW w:type="dxa" w:w="1587"/>
+            <w:tcW w:type="dxa" w:w="1701"/>
             <w:vAlign w:val="center"/>
             <w:tcMar>
               <w:top w:w="75" w:type="dxa"/>
@@ -5718,7 +6106,7 @@
                 <w:rFonts w:ascii="Arial" w:hAnsi="Arial"/>
                 <w:b w:val="0"/>
                 <w:color w:val="000000"/>
-                <w:sz w:val="18"/>
+                <w:sz w:val="19"/>
               </w:rPr>
               <w:t>00:30–01:30</w:t>
             </w:r>
@@ -5726,7 +6114,7 @@
         </w:tc>
         <w:tc>
           <w:tcPr>
-            <w:tcW w:type="dxa" w:w="1814"/>
+            <w:tcW w:type="dxa" w:w="2438"/>
             <w:vAlign w:val="center"/>
             <w:tcMar>
               <w:top w:w="75" w:type="dxa"/>
@@ -5752,15 +6140,15 @@
                 <w:rFonts w:ascii="Arial" w:hAnsi="Arial"/>
                 <w:b w:val="0"/>
                 <w:color w:val="000000"/>
-                <w:sz w:val="18"/>
+                <w:sz w:val="19"/>
               </w:rPr>
-              <w:t>Desarrollo y fallo</w:t>
+              <w:t>Desarrollo y pruebas</w:t>
             </w:r>
           </w:p>
         </w:tc>
         <w:tc>
           <w:tcPr>
-            <w:tcW w:type="dxa" w:w="6463"/>
+            <w:tcW w:type="dxa" w:w="5726"/>
             <w:vAlign w:val="center"/>
             <w:tcMar>
               <w:top w:w="75" w:type="dxa"/>
@@ -5786,9 +6174,9 @@
                 <w:rFonts w:ascii="Arial" w:hAnsi="Arial"/>
                 <w:b w:val="0"/>
                 <w:color w:val="000000"/>
-                <w:sz w:val="18"/>
+                <w:sz w:val="19"/>
               </w:rPr>
-              <w:t>Equipo y conexiones, programación y evidencia del rechazo ALARM9. No simular LEDs quemados ni errores de compilación como hechos.</w:t>
+              <w:t>Investigación, programación asistida, conexiones y comprobaciones del montaje.</w:t>
             </w:r>
           </w:p>
         </w:tc>
@@ -5799,7 +6187,7 @@
         </w:trPr>
         <w:tc>
           <w:tcPr>
-            <w:tcW w:type="dxa" w:w="1587"/>
+            <w:tcW w:type="dxa" w:w="1701"/>
             <w:vAlign w:val="center"/>
             <w:tcMar>
               <w:top w:w="75" w:type="dxa"/>
@@ -5824,7 +6212,7 @@
                 <w:rFonts w:ascii="Arial" w:hAnsi="Arial"/>
                 <w:b w:val="0"/>
                 <w:color w:val="000000"/>
-                <w:sz w:val="18"/>
+                <w:sz w:val="19"/>
               </w:rPr>
               <w:t>01:30–02:30</w:t>
             </w:r>
@@ -5832,7 +6220,7 @@
         </w:tc>
         <w:tc>
           <w:tcPr>
-            <w:tcW w:type="dxa" w:w="1814"/>
+            <w:tcW w:type="dxa" w:w="2438"/>
             <w:vAlign w:val="center"/>
             <w:tcMar>
               <w:top w:w="75" w:type="dxa"/>
@@ -5858,7 +6246,7 @@
                 <w:rFonts w:ascii="Arial" w:hAnsi="Arial"/>
                 <w:b w:val="0"/>
                 <w:color w:val="000000"/>
-                <w:sz w:val="18"/>
+                <w:sz w:val="19"/>
               </w:rPr>
               <w:t>La construcción</w:t>
             </w:r>
@@ -5866,7 +6254,7 @@
         </w:tc>
         <w:tc>
           <w:tcPr>
-            <w:tcW w:type="dxa" w:w="6463"/>
+            <w:tcW w:type="dxa" w:w="5726"/>
             <w:vAlign w:val="center"/>
             <w:tcMar>
               <w:top w:w="75" w:type="dxa"/>
@@ -5892,9 +6280,9 @@
                 <w:rFonts w:ascii="Arial" w:hAnsi="Arial"/>
                 <w:b w:val="0"/>
                 <w:color w:val="000000"/>
-                <w:sz w:val="18"/>
+                <w:sz w:val="19"/>
               </w:rPr>
-              <w:t>Impresión 3D, ensamblaje, motores y acoplamiento; mostrar el modelo exacto de Fusion.</w:t>
+              <w:t>Modelo, impresión, armado e integración de los componentes.</w:t>
             </w:r>
           </w:p>
         </w:tc>
@@ -5905,7 +6293,7 @@
         </w:trPr>
         <w:tc>
           <w:tcPr>
-            <w:tcW w:type="dxa" w:w="1587"/>
+            <w:tcW w:type="dxa" w:w="1701"/>
             <w:vAlign w:val="center"/>
             <w:tcMar>
               <w:top w:w="75" w:type="dxa"/>
@@ -5930,7 +6318,7 @@
                 <w:rFonts w:ascii="Arial" w:hAnsi="Arial"/>
                 <w:b w:val="0"/>
                 <w:color w:val="000000"/>
-                <w:sz w:val="18"/>
+                <w:sz w:val="19"/>
               </w:rPr>
               <w:t>02:30–03:00</w:t>
             </w:r>
@@ -5938,7 +6326,7 @@
         </w:tc>
         <w:tc>
           <w:tcPr>
-            <w:tcW w:type="dxa" w:w="1814"/>
+            <w:tcW w:type="dxa" w:w="2438"/>
             <w:vAlign w:val="center"/>
             <w:tcMar>
               <w:top w:w="75" w:type="dxa"/>
@@ -5964,15 +6352,15 @@
                 <w:rFonts w:ascii="Arial" w:hAnsi="Arial"/>
                 <w:b w:val="0"/>
                 <w:color w:val="000000"/>
-                <w:sz w:val="18"/>
+                <w:sz w:val="19"/>
               </w:rPr>
-              <w:t>El resultado</w:t>
+              <w:t>El resultado y la idea</w:t>
             </w:r>
           </w:p>
         </w:tc>
         <w:tc>
           <w:tcPr>
-            <w:tcW w:type="dxa" w:w="6463"/>
+            <w:tcW w:type="dxa" w:w="5726"/>
             <w:vAlign w:val="center"/>
             <w:tcMar>
               <w:top w:w="75" w:type="dxa"/>
@@ -5998,9 +6386,9 @@
                 <w:rFonts w:ascii="Arial" w:hAnsi="Arial"/>
                 <w:b w:val="0"/>
                 <w:color w:val="000000"/>
-                <w:sz w:val="18"/>
+                <w:sz w:val="19"/>
               </w:rPr>
-              <w:t>Integración y ensayos documentados. Mantener estado de escritura en papel pendiente y completar la toma de todo el equipo cuando exista.</w:t>
+              <w:t>Interacción y lo conseguido, aclarando que la escritura sobre papel sigue por comprobar.</w:t>
             </w:r>
           </w:p>
         </w:tc>
@@ -6016,7 +6404,7 @@
         <w:rPr>
           <w:b w:val="0"/>
         </w:rPr>
-        <w:t>Completar las tomas de prompts históricos, fallo real, escritura con lápiz y todo el equipo cuando existan. Los registros técnicos y las recreaciones didácticas deben identificarse en pantalla. No sustituir esas tomas por un resultado inventado.</w:t>
+        <w:t>El objetivo es escribir sobre papel. La evidencia disponible acredita integración, preparación y un ensayo sin lápiz; no acredita todavía el trazo sobre una hoja.</w:t>
       </w:r>
     </w:p>
     <w:p>
@@ -6024,20 +6412,7 @@
         <w:rPr>
           <w:b w:val="0"/>
         </w:rPr>
-        <w:t>No proyectar claves API, tokens, contraseñas, datos privados ni rutas seriales. Preparar la reproducción evitando que los audios del video activen órdenes del asistente.</w:t>
-      </w:r>
-    </w:p>
-    <w:p>
-      <w:r>
-        <w:br w:type="page"/>
-      </w:r>
-    </w:p>
-    <w:p>
-      <w:pPr>
-        <w:pStyle w:val="Heading1"/>
-      </w:pPr>
-      <w:r>
-        <w:t>Alcance técnico y fuentes locales</w:t>
+        <w:t>La guía pide capturas iniciales con Gemini, un fallo real y una toma final del equipo. El material presentado debe identificarse por lo que realmente muestra. No se atribuyen a las imágenes resultados físicos ni sesiones históricas que no estén documentados.</w:t>
       </w:r>
     </w:p>
     <w:p>
@@ -6045,7 +6420,7 @@
         <w:pStyle w:val="Heading2"/>
       </w:pPr>
       <w:r>
-        <w:t>Qué respalda la evidencia</w:t>
+        <w:t>Base del modelo y comprobaciones</w:t>
       </w:r>
     </w:p>
     <w:p>
@@ -6053,7 +6428,7 @@
         <w:rPr>
           <w:b w:val="0"/>
         </w:rPr>
-        <w:t>La validación final registra 299 pruebas locales y 299 en la Raspberry, además de 16 casos semánticos. El barrido físico R6 del 14 de octubre aceptó un área de 61.699 × 72.488 mm. Con margen de 3 mm, el interior geométrico disponible es de 55.699 × 66.488 mm. El ensayo de HOLA fue en seco, sin lápiz.</w:t>
+        <w:t>Base mecánica Simple CNC Plotter de mith, derivada de DAZ_projects; se distinguen los modelos publicados de las adaptaciones del equipo.</w:t>
       </w:r>
     </w:p>
     <w:p>
@@ -6061,7 +6436,7 @@
         <w:rPr>
           <w:b w:val="0"/>
         </w:rPr>
-        <w:t>El último perfil conserva dry_run_without_pen=true, pen_contact_confirmed_by_user=false y z_calibrated=false. La escritura sobre papel no está acreditada. La última instantánea está desconectada y no prueba que el robot esté preparado hoy. La referencia Z requiere comprobación física por una persona en la sesión.</w:t>
+        <w:t>El caso ALARM9 se documentó durante una medición: se compararon recorridos distintos y el programa rechazó el resultado. La causa física no quedó establecida. El control R6 añadió comprobaciones para las condiciones de arranque y después se registró una medición válida. La prueba de HOLA fue sin lápiz.</w:t>
       </w:r>
     </w:p>
     <w:p>
@@ -6069,7 +6444,7 @@
         <w:rPr>
           <w:b w:val="0"/>
         </w:rPr>
-        <w:t>ALARM9 rechazó recorridos X inconsistentes: SCAN 60.230 y 60.240, repetición 62.208; la diferencia de 1.978 mm superó la tolerancia de 0.6023 mm. Su causa física no quedó establecida. R6 permite un máximo de un tope inicialmente activo por eje, retira la excepción al liberar y rechaza conflictos; la medición posterior fue válida.</w:t>
+        <w:t>Área medida: 61,699 × 72,488 mm. El margen de 3 mm por lado deja un interior de 55,699 × 66,488 mm. Estas medidas describen el recorrido y no garantizan por sí solas la precisión del trazo.</w:t>
       </w:r>
     </w:p>
     <w:p>
@@ -6077,7 +6452,7 @@
         <w:pStyle w:val="Heading2"/>
       </w:pPr>
       <w:r>
-        <w:t>Inicialización y ciclo del firmware</w:t>
+        <w:t>Documentos para preparar respuestas</w:t>
       </w:r>
     </w:p>
     <w:p>
@@ -6085,174 +6460,7 @@
         <w:rPr>
           <w:b w:val="0"/>
         </w:rPr>
-        <w:t>La guía usa setup() y loop() como conceptos de Arduino. El GRBL adaptado implementa su entrada principal en main.c: main() configura comunicación, ajustes y motores, y llama a protocol_main_loop() dentro de un ciclo continuo. Ese es el código que se debe mostrar. No trasladar los nombres setup() y loop() al Python de la Raspberry ni inventarlos como funciones propias de este firmware.</w:t>
-      </w:r>
-    </w:p>
-    <w:p>
-      <w:pPr>
-        <w:pStyle w:val="Heading2"/>
-      </w:pPr>
-      <w:r>
-        <w:t>Archivos para sustentar las afirmaciones</w:t>
-      </w:r>
-    </w:p>
-    <w:p>
-      <w:pPr>
-        <w:spacing w:after="40"/>
-      </w:pPr>
-      <w:r>
-        <w:rPr>
-          <w:b/>
-        </w:rPr>
-        <w:t>technical_evidence.md</w:t>
-      </w:r>
-    </w:p>
-    <w:p>
-      <w:r>
-        <w:rPr>
-          <w:b w:val="0"/>
-        </w:rPr>
-        <w:t>Síntesis técnica y límites de la evidencia disponible.</w:t>
-      </w:r>
-    </w:p>
-    <w:p>
-      <w:pPr>
-        <w:spacing w:after="40"/>
-      </w:pPr>
-      <w:r>
-        <w:rPr>
-          <w:b/>
-        </w:rPr>
-        <w:t>work/aria_alarm9_20261014/final-validation.json</w:t>
-      </w:r>
-    </w:p>
-    <w:p>
-      <w:r>
-        <w:rPr>
-          <w:b w:val="0"/>
-        </w:rPr>
-        <w:t>Pruebas, casos semánticos, perfil y estado final.</w:t>
-      </w:r>
-    </w:p>
-    <w:p>
-      <w:pPr>
-        <w:spacing w:after="40"/>
-      </w:pPr>
-      <w:r>
-        <w:rPr>
-          <w:b/>
-        </w:rPr>
-        <w:t>work/aria_alarm9_20261014/measurement-r6-validation.json</w:t>
-      </w:r>
-    </w:p>
-    <w:p>
-      <w:r>
-        <w:rPr>
-          <w:b w:val="0"/>
-        </w:rPr>
-        <w:t>Barrido físico, respuestas del controlador y área guardada.</w:t>
-      </w:r>
-    </w:p>
-    <w:p>
-      <w:pPr>
-        <w:spacing w:after="40"/>
-      </w:pPr>
-      <w:r>
-        <w:rPr>
-          <w:b/>
-        </w:rPr>
-        <w:t>work/aria_alarm9_20261014/diagnosis.json</w:t>
-      </w:r>
-    </w:p>
-    <w:p>
-      <w:r>
-        <w:rPr>
-          <w:b w:val="0"/>
-        </w:rPr>
-        <w:t>Rechazo real ALARM9 y comparación de recorridos.</w:t>
-      </w:r>
-    </w:p>
-    <w:p>
-      <w:pPr>
-        <w:spacing w:after="40"/>
-      </w:pPr>
-      <w:r>
-        <w:rPr>
-          <w:b/>
-        </w:rPr>
-        <w:t>work/aria_alarm9_20261014/firmware_r6/VALIDATION.md</w:t>
-      </w:r>
-    </w:p>
-    <w:p>
-      <w:r>
-        <w:rPr>
-          <w:b w:val="0"/>
-        </w:rPr>
-        <w:t>Alcance del cambio de firmware y pruebas.</w:t>
-      </w:r>
-    </w:p>
-    <w:p>
-      <w:pPr>
-        <w:spacing w:after="40"/>
-      </w:pPr>
-      <w:r>
-        <w:rPr>
-          <w:b/>
-        </w:rPr>
-        <w:t>work/aria_alarm9_20261014/stage_r6/LEEME.md</w:t>
-      </w:r>
-    </w:p>
-    <w:p>
-      <w:r>
-        <w:rPr>
-          <w:b w:val="0"/>
-        </w:rPr>
-        <w:t>Pi4B, audio, activación y proveedores configurados.</w:t>
-      </w:r>
-    </w:p>
-    <w:p>
-      <w:pPr>
-        <w:spacing w:after="40"/>
-      </w:pPr>
-      <w:r>
-        <w:rPr>
-          <w:b/>
-        </w:rPr>
-        <w:t>revision_cnc/inspeccion_fusion_piezas.json</w:t>
-      </w:r>
-    </w:p>
-    <w:p>
-      <w:r>
-        <w:rPr>
-          <w:b w:val="0"/>
-        </w:rPr>
-        <w:t>Inspección del ensamblaje y geometría en Fusion.</w:t>
-      </w:r>
-    </w:p>
-    <w:p>
-      <w:pPr>
-        <w:pStyle w:val="Heading2"/>
-      </w:pPr>
-      <w:r>
-        <w:t>Atribución del modelo</w:t>
-      </w:r>
-    </w:p>
-    <w:p>
-      <w:r>
-        <w:rPr>
-          <w:b w:val="0"/>
-        </w:rPr>
-        <w:t>Simple CNC Plotter de mith, Thingiverse 4796222, derivado de DAZ_projects 4579436. Firmware de origen TGit-Tech/GRBL-28byj-48, adaptado para ARIA. Distinguir la base publicada de las adaptaciones del proyecto.</w:t>
-      </w:r>
-    </w:p>
-    <w:p>
-      <w:r>
-        <w:rPr>
-          <w:b w:val="0"/>
-        </w:rPr>
-        <w:t>Modelo: https://www.thingiverse.com/thing:4796222</w:t>
-        <w:br/>
-        <w:t>Firmware base: https://github.com/TGit-Tech/GRBL-28byj-48</w:t>
+        <w:t>Consultar la guía SENA original, technical_evidence.md, el presupuesto y sus fuentes. Los registros de validación final, medición R6 y diagnóstico ALARM9 respaldan los hechos técnicos. No es necesario leer estos nombres durante la exposición.</w:t>
       </w:r>
     </w:p>
     <w:p>
@@ -6273,7 +6481,7 @@
         <w:rPr>
           <w:b w:val="0"/>
         </w:rPr>
-        <w:t>Precios y disponibilidad observados el 15 de octubre de 2026. Son referencias públicas sujetas a cambios; las fuentes E de la tabla son reservas propias, no cotizaciones formales.</w:t>
+        <w:t>Precios y disponibilidad observados el 15 de octubre de 2026. Son referencias públicas que pueden cambiar. Los valores estimados de la tabla son reservas propias.</w:t>
       </w:r>
     </w:p>
     <w:p>
@@ -6296,13 +6504,16 @@
       <w:pPr>
         <w:spacing w:after="160"/>
       </w:pPr>
-      <w:r>
-        <w:rPr>
-          <w:b w:val="0"/>
-          <w:sz w:val="17"/>
-        </w:rPr>
-        <w:t>https://servotronik.com.co/tienda/motores-y-servomotores/motor-paso-a-paso-28byj-48-uln2003/</w:t>
-      </w:r>
+      <w:hyperlink r:id="rId11">
+        <w:r>
+          <w:rPr>
+            <w:rFonts w:ascii="Arial" w:hAnsi="Arial"/>
+            <w:sz w:val="17"/>
+            <w:color w:val="000000"/>
+          </w:rPr>
+          <w:t>https://servotronik.com.co/tienda/motores-y-servomotores/motor-paso-a-paso-28byj-48-uln2003/</w:t>
+        </w:r>
+      </w:hyperlink>
     </w:p>
     <w:p>
       <w:pPr>
@@ -6324,13 +6535,16 @@
       <w:pPr>
         <w:spacing w:after="160"/>
       </w:pPr>
-      <w:r>
-        <w:rPr>
-          <w:b w:val="0"/>
-          <w:sz w:val="17"/>
-        </w:rPr>
-        <w:t>https://www.vistronica.com/board-de-desarrollo/arduino/board/arduino-uno-r3-con-ch340-detail.html</w:t>
-      </w:r>
+      <w:hyperlink r:id="rId12">
+        <w:r>
+          <w:rPr>
+            <w:rFonts w:ascii="Arial" w:hAnsi="Arial"/>
+            <w:sz w:val="17"/>
+            <w:color w:val="000000"/>
+          </w:rPr>
+          <w:t>https://www.vistronica.com/board-de-desarrollo/arduino/board/arduino-uno-r3-con-ch340-detail.html</w:t>
+        </w:r>
+      </w:hyperlink>
     </w:p>
     <w:p>
       <w:pPr>
@@ -6352,13 +6566,16 @@
       <w:pPr>
         <w:spacing w:after="160"/>
       </w:pPr>
-      <w:r>
-        <w:rPr>
-          <w:b w:val="0"/>
-          <w:sz w:val="17"/>
-        </w:rPr>
-        <w:t>https://electronilab.co/tienda/raspberry-pi-4-modelo-b-4gb-ram/</w:t>
-      </w:r>
+      <w:hyperlink r:id="rId13">
+        <w:r>
+          <w:rPr>
+            <w:rFonts w:ascii="Arial" w:hAnsi="Arial"/>
+            <w:sz w:val="17"/>
+            <w:color w:val="000000"/>
+          </w:rPr>
+          <w:t>https://electronilab.co/tienda/raspberry-pi-4-modelo-b-4gb-ram/</w:t>
+        </w:r>
+      </w:hyperlink>
     </w:p>
     <w:p>
       <w:pPr>
@@ -6380,13 +6597,16 @@
       <w:pPr>
         <w:spacing w:after="160"/>
       </w:pPr>
-      <w:r>
-        <w:rPr>
-          <w:b w:val="0"/>
-          <w:sz w:val="17"/>
-        </w:rPr>
-        <w:t>https://www.vistronica.com/conectores-cables-y-switches/cable-dupont-hembra-macho-detail.html</w:t>
-      </w:r>
+      <w:hyperlink r:id="rId14">
+        <w:r>
+          <w:rPr>
+            <w:rFonts w:ascii="Arial" w:hAnsi="Arial"/>
+            <w:sz w:val="17"/>
+            <w:color w:val="000000"/>
+          </w:rPr>
+          <w:t>https://www.vistronica.com/conectores-cables-y-switches/cable-dupont-hembra-macho-detail.html</w:t>
+        </w:r>
+      </w:hyperlink>
     </w:p>
     <w:p>
       <w:pPr>
@@ -6408,13 +6628,16 @@
       <w:pPr>
         <w:spacing w:after="160"/>
       </w:pPr>
-      <w:r>
-        <w:rPr>
-          <w:b w:val="0"/>
-          <w:sz w:val="17"/>
-        </w:rPr>
-        <w:t>https://www.vistronica.com/conectores-cables-y-switches/cable-dupont-macho-macho-x40-20-cm-detail.html</w:t>
-      </w:r>
+      <w:hyperlink r:id="rId15">
+        <w:r>
+          <w:rPr>
+            <w:rFonts w:ascii="Arial" w:hAnsi="Arial"/>
+            <w:sz w:val="17"/>
+            <w:color w:val="000000"/>
+          </w:rPr>
+          <w:t>https://www.vistronica.com/conectores-cables-y-switches/cable-dupont-macho-macho-x40-20-cm-detail.html</w:t>
+        </w:r>
+      </w:hyperlink>
     </w:p>
     <w:p>
       <w:pPr>
@@ -6436,13 +6659,16 @@
       <w:pPr>
         <w:spacing w:after="160"/>
       </w:pPr>
-      <w:r>
-        <w:rPr>
-          <w:b w:val="0"/>
-          <w:sz w:val="17"/>
-        </w:rPr>
-        <w:t>https://impresion3dsoluciones.com/products/filamento-pla</w:t>
-      </w:r>
+      <w:hyperlink r:id="rId16">
+        <w:r>
+          <w:rPr>
+            <w:rFonts w:ascii="Arial" w:hAnsi="Arial"/>
+            <w:sz w:val="17"/>
+            <w:color w:val="000000"/>
+          </w:rPr>
+          <w:t>https://impresion3dsoluciones.com/products/filamento-pla</w:t>
+        </w:r>
+      </w:hyperlink>
     </w:p>
     <w:p>
       <w:pPr>
@@ -6464,13 +6690,16 @@
       <w:pPr>
         <w:spacing w:after="160"/>
       </w:pPr>
-      <w:r>
-        <w:rPr>
-          <w:b w:val="0"/>
-          <w:sz w:val="17"/>
-        </w:rPr>
-        <w:t>https://impresion3dsoluciones.com/pages/calculadora-impresion-3d</w:t>
-      </w:r>
+      <w:hyperlink r:id="rId17">
+        <w:r>
+          <w:rPr>
+            <w:rFonts w:ascii="Arial" w:hAnsi="Arial"/>
+            <w:sz w:val="17"/>
+            <w:color w:val="000000"/>
+          </w:rPr>
+          <w:t>https://impresion3dsoluciones.com/pages/calculadora-impresion-3d</w:t>
+        </w:r>
+      </w:hyperlink>
     </w:p>
     <w:p>
       <w:pPr>
@@ -6492,13 +6721,16 @@
       <w:pPr>
         <w:spacing w:after="160"/>
       </w:pPr>
-      <w:r>
-        <w:rPr>
-          <w:b w:val="0"/>
-          <w:sz w:val="17"/>
-        </w:rPr>
-        <w:t>https://www.datos.gov.co/resource/mcec-87by.json</w:t>
-      </w:r>
+      <w:hyperlink r:id="rId18">
+        <w:r>
+          <w:rPr>
+            <w:rFonts w:ascii="Arial" w:hAnsi="Arial"/>
+            <w:sz w:val="17"/>
+            <w:color w:val="000000"/>
+          </w:rPr>
+          <w:t>https://www.datos.gov.co/resource/mcec-87by.json</w:t>
+        </w:r>
+      </w:hyperlink>
     </w:p>
     <w:p>
       <w:r>
@@ -6518,7 +6750,7 @@
         <w:rPr>
           <w:b w:val="0"/>
         </w:rPr>
-        <w:t>Precios y disponibilidad observados el 15 de octubre de 2026. Son referencias públicas sujetas a cambios; las fuentes E de la tabla son reservas propias, no cotizaciones formales.</w:t>
+        <w:t>Precios y disponibilidad observados el 15 de octubre de 2026. Son referencias públicas que pueden cambiar. Los valores estimados de la tabla son reservas propias.</w:t>
       </w:r>
     </w:p>
     <w:p>
@@ -6541,13 +6773,16 @@
       <w:pPr>
         <w:spacing w:after="160"/>
       </w:pPr>
-      <w:r>
-        <w:rPr>
-          <w:b w:val="0"/>
-          <w:sz w:val="17"/>
-        </w:rPr>
-        <w:t>https://platform.openai.com/settings/organization/billing/overview</w:t>
-      </w:r>
+      <w:hyperlink r:id="rId19">
+        <w:r>
+          <w:rPr>
+            <w:rFonts w:ascii="Arial" w:hAnsi="Arial"/>
+            <w:sz w:val="17"/>
+            <w:color w:val="000000"/>
+          </w:rPr>
+          <w:t>https://platform.openai.com/settings/organization/billing/overview</w:t>
+        </w:r>
+      </w:hyperlink>
     </w:p>
     <w:p>
       <w:pPr>
@@ -6569,13 +6804,16 @@
       <w:pPr>
         <w:spacing w:after="160"/>
       </w:pPr>
-      <w:r>
-        <w:rPr>
-          <w:b w:val="0"/>
-          <w:sz w:val="17"/>
-        </w:rPr>
-        <w:t>https://elevenlabs.io/docs/overview/administration/pay-as-you-go</w:t>
-      </w:r>
+      <w:hyperlink r:id="rId20">
+        <w:r>
+          <w:rPr>
+            <w:rFonts w:ascii="Arial" w:hAnsi="Arial"/>
+            <w:sz w:val="17"/>
+            <w:color w:val="000000"/>
+          </w:rPr>
+          <w:t>https://elevenlabs.io/docs/overview/administration/pay-as-you-go</w:t>
+        </w:r>
+      </w:hyperlink>
     </w:p>
     <w:p>
       <w:pPr>
@@ -6597,13 +6835,25 @@
       <w:pPr>
         <w:spacing w:after="160"/>
       </w:pPr>
-      <w:r>
-        <w:rPr>
-          <w:b w:val="0"/>
-          <w:sz w:val="17"/>
-        </w:rPr>
-        <w:t>https://www.vistronica.com/fuente-de-voltaje/fuente-de-alimentacion-usb-c-para-raspberry-pi-4-con-interruptor-detail.html</w:t>
-      </w:r>
+      <w:hyperlink r:id="rId21">
+        <w:r>
+          <w:rPr>
+            <w:rFonts w:ascii="Arial" w:hAnsi="Arial"/>
+            <w:sz w:val="17"/>
+            <w:color w:val="000000"/>
+          </w:rPr>
+          <w:t>https://www.vistronica.com/fuente-de-voltaje/</w:t>
+        </w:r>
+        <w:r>
+          <w:rPr>
+            <w:rFonts w:ascii="Arial" w:hAnsi="Arial"/>
+            <w:sz w:val="17"/>
+            <w:color w:val="000000"/>
+          </w:rPr>
+          <w:br/>
+          <w:t>fuente-de-alimentacion-usb-c-para-raspberry-pi-4-con-interruptor-detail.html</w:t>
+        </w:r>
+      </w:hyperlink>
     </w:p>
     <w:p>
       <w:pPr>
@@ -6625,13 +6875,16 @@
       <w:pPr>
         <w:spacing w:after="160"/>
       </w:pPr>
-      <w:r>
-        <w:rPr>
-          <w:b w:val="0"/>
-          <w:sz w:val="17"/>
-        </w:rPr>
-        <w:t>https://servotronik.com.co/tienda/miscelaneos/fuente-5v-2a/</w:t>
-      </w:r>
+      <w:hyperlink r:id="rId22">
+        <w:r>
+          <w:rPr>
+            <w:rFonts w:ascii="Arial" w:hAnsi="Arial"/>
+            <w:sz w:val="17"/>
+            <w:color w:val="000000"/>
+          </w:rPr>
+          <w:t>https://servotronik.com.co/tienda/miscelaneos/fuente-5v-2a/</w:t>
+        </w:r>
+      </w:hyperlink>
     </w:p>
     <w:p>
       <w:pPr>
@@ -6653,13 +6906,25 @@
       <w:pPr>
         <w:spacing w:after="160"/>
       </w:pPr>
-      <w:r>
-        <w:rPr>
-          <w:b w:val="0"/>
-          <w:sz w:val="17"/>
-        </w:rPr>
-        <w:t>https://www.vistronica.com/conectores-cables-y-switches/placas-universales/protoboard/protoboard-mb102-830-puntos-detail.html</w:t>
-      </w:r>
+      <w:hyperlink r:id="rId23">
+        <w:r>
+          <w:rPr>
+            <w:rFonts w:ascii="Arial" w:hAnsi="Arial"/>
+            <w:sz w:val="17"/>
+            <w:color w:val="000000"/>
+          </w:rPr>
+          <w:t>https://www.vistronica.com/conectores-cables-y-switches/placas-universales/protoboard/</w:t>
+        </w:r>
+        <w:r>
+          <w:rPr>
+            <w:rFonts w:ascii="Arial" w:hAnsi="Arial"/>
+            <w:sz w:val="17"/>
+            <w:color w:val="000000"/>
+          </w:rPr>
+          <w:br/>
+          <w:t>protoboard-mb102-830-puntos-detail.html</w:t>
+        </w:r>
+      </w:hyperlink>
     </w:p>
     <w:p>
       <w:pPr>
@@ -6681,13 +6946,16 @@
       <w:pPr>
         <w:spacing w:after="160"/>
       </w:pPr>
-      <w:r>
-        <w:rPr>
-          <w:b w:val="0"/>
-          <w:sz w:val="17"/>
-        </w:rPr>
-        <w:t>https://electronilab.co/tienda/memoria-micro-sd-32gb-sandisk-ultra-uhi-iclase-10-80mbs-adaptador/</w:t>
-      </w:r>
+      <w:hyperlink r:id="rId24">
+        <w:r>
+          <w:rPr>
+            <w:rFonts w:ascii="Arial" w:hAnsi="Arial"/>
+            <w:sz w:val="17"/>
+            <w:color w:val="000000"/>
+          </w:rPr>
+          <w:t>https://electronilab.co/tienda/memoria-micro-sd-32gb-sandisk-ultra-uhi-iclase-10-80mbs-adaptador/</w:t>
+        </w:r>
+      </w:hyperlink>
     </w:p>
     <w:p>
       <w:pPr>
@@ -6709,13 +6977,16 @@
       <w:pPr>
         <w:spacing w:after="160"/>
       </w:pPr>
-      <w:r>
-        <w:rPr>
-          <w:b w:val="0"/>
-          <w:sz w:val="17"/>
-        </w:rPr>
-        <w:t>https://servotronik.com.co/tienda/miscelaneos/final-de-carrera-10amp-sin-lengueta/</w:t>
-      </w:r>
+      <w:hyperlink r:id="rId25">
+        <w:r>
+          <w:rPr>
+            <w:rFonts w:ascii="Arial" w:hAnsi="Arial"/>
+            <w:sz w:val="17"/>
+            <w:color w:val="000000"/>
+          </w:rPr>
+          <w:t>https://servotronik.com.co/tienda/miscelaneos/final-de-carrera-10amp-sin-lengueta/</w:t>
+        </w:r>
+      </w:hyperlink>
     </w:p>
     <w:p>
       <w:pPr>
@@ -6737,13 +7008,16 @@
       <w:pPr>
         <w:spacing w:after="160"/>
       </w:pPr>
-      <w:r>
-        <w:rPr>
-          <w:b w:val="0"/>
-          <w:sz w:val="17"/>
-        </w:rPr>
-        <w:t>https://www.vistronica.com/herramientas/tornilleria-/tornillo-allen-cabeza-avellanada-m3x10-mm-detail.html</w:t>
-      </w:r>
+      <w:hyperlink r:id="rId26">
+        <w:r>
+          <w:rPr>
+            <w:rFonts w:ascii="Arial" w:hAnsi="Arial"/>
+            <w:sz w:val="17"/>
+            <w:color w:val="000000"/>
+          </w:rPr>
+          <w:t>https://www.vistronica.com/herramientas/tornilleria-/tornillo-allen-cabeza-avellanada-m3x10-mm-detail.html</w:t>
+        </w:r>
+      </w:hyperlink>
     </w:p>
     <w:sectPr>
       <w:headerReference w:type="default" r:id="rId9"/>
@@ -7156,12 +7430,12 @@
     <w:qFormat/>
     <w:rsid w:val="00FC693F"/>
     <w:pPr>
-      <w:spacing w:line="269" w:lineRule="auto" w:after="140"/>
+      <w:spacing w:line="259" w:lineRule="auto" w:after="140"/>
     </w:pPr>
     <w:rPr>
       <w:rFonts w:ascii="Arial" w:hAnsi="Arial"/>
       <w:color w:val="000000"/>
-      <w:sz w:val="21"/>
+      <w:sz w:val="22"/>
     </w:rPr>
   </w:style>
   <w:style w:type="paragraph" w:styleId="Header">

</xml_diff>